<commit_message>
Se crea carpeta Fase 2, se agrega Modelo 4+1 y formato de dailys.
</commit_message>
<xml_diff>
--- a/Fase 1/Evidencias Grupales/1.5_GuiaEstudiante_Fase 1_Definicion Proyecto APT (Español).docx
+++ b/Fase 1/Evidencias Grupales/1.5_GuiaEstudiante_Fase 1_Definicion Proyecto APT (Español).docx
@@ -602,12 +602,12 @@
               <w:spacing w:line="240" w:lineRule="auto"/>
               <w:jc w:val="both"/>
               <w:rPr>
-                <w:b/>
-              </w:rPr>
-            </w:pPr>
-            <w:r>
-              <w:rPr>
-                <w:b/>
+                <w:bCs/>
+              </w:rPr>
+            </w:pPr>
+            <w:r>
+              <w:rPr>
+                <w:bCs/>
               </w:rPr>
               <w:t>Erick Daniel Quinchavil Flores</w:t>
             </w:r>
@@ -665,12 +665,12 @@
               <w:spacing w:line="240" w:lineRule="auto"/>
               <w:jc w:val="both"/>
               <w:rPr>
-                <w:b/>
-              </w:rPr>
-            </w:pPr>
-            <w:r>
-              <w:rPr>
-                <w:b/>
+                <w:bCs/>
+              </w:rPr>
+            </w:pPr>
+            <w:r>
+              <w:rPr>
+                <w:bCs/>
               </w:rPr>
               <w:t>20.395.484-0</w:t>
             </w:r>
@@ -721,18 +721,18 @@
               <w:spacing w:line="240" w:lineRule="auto"/>
               <w:jc w:val="both"/>
               <w:rPr>
-                <w:b/>
-              </w:rPr>
-            </w:pPr>
-            <w:r>
-              <w:rPr>
-                <w:b/>
+                <w:bCs/>
+              </w:rPr>
+            </w:pPr>
+            <w:r>
+              <w:rPr>
+                <w:bCs/>
               </w:rPr>
               <w:t>Brandon Israel Cayuela</w:t>
             </w:r>
             <w:r>
               <w:rPr>
-                <w:b/>
+                <w:bCs/>
               </w:rPr>
               <w:t xml:space="preserve"> Herrera</w:t>
             </w:r>
@@ -790,12 +790,12 @@
               <w:spacing w:line="240" w:lineRule="auto"/>
               <w:jc w:val="both"/>
               <w:rPr>
-                <w:b/>
-              </w:rPr>
-            </w:pPr>
-            <w:r>
-              <w:rPr>
-                <w:b/>
+                <w:bCs/>
+              </w:rPr>
+            </w:pPr>
+            <w:r>
+              <w:rPr>
+                <w:bCs/>
               </w:rPr>
               <w:t>21.163.969-5</w:t>
             </w:r>
@@ -839,12 +839,12 @@
               <w:spacing w:line="240" w:lineRule="auto"/>
               <w:jc w:val="both"/>
               <w:rPr>
-                <w:b/>
-              </w:rPr>
-            </w:pPr>
-            <w:r>
-              <w:rPr>
-                <w:b/>
+                <w:bCs/>
+              </w:rPr>
+            </w:pPr>
+            <w:r>
+              <w:rPr>
+                <w:bCs/>
               </w:rPr>
               <w:t xml:space="preserve">Ingeniería en Informática </w:t>
             </w:r>
@@ -888,12 +888,12 @@
               <w:spacing w:line="240" w:lineRule="auto"/>
               <w:jc w:val="both"/>
               <w:rPr>
-                <w:b/>
-              </w:rPr>
-            </w:pPr>
-            <w:r>
-              <w:rPr>
-                <w:b/>
+                <w:bCs/>
+              </w:rPr>
+            </w:pPr>
+            <w:r>
+              <w:rPr>
+                <w:bCs/>
               </w:rPr>
               <w:t>Plaza Vespucio</w:t>
             </w:r>
@@ -1061,18 +1061,18 @@
               <w:spacing w:line="240" w:lineRule="auto"/>
               <w:jc w:val="both"/>
               <w:rPr>
-                <w:b/>
-              </w:rPr>
-            </w:pPr>
-            <w:r>
-              <w:rPr>
-                <w:b/>
+                <w:bCs/>
+              </w:rPr>
+            </w:pPr>
+            <w:r>
+              <w:rPr>
+                <w:bCs/>
               </w:rPr>
               <w:t>Se</w:t>
             </w:r>
             <w:r>
               <w:rPr>
-                <w:b/>
+                <w:bCs/>
               </w:rPr>
               <w:t>gurIA-LPR</w:t>
             </w:r>
@@ -1116,12 +1116,12 @@
               <w:spacing w:line="240" w:lineRule="auto"/>
               <w:jc w:val="both"/>
               <w:rPr>
-                <w:b/>
-              </w:rPr>
-            </w:pPr>
-            <w:r>
-              <w:rPr>
-                <w:b/>
+                <w:bCs/>
+              </w:rPr>
+            </w:pPr>
+            <w:r>
+              <w:rPr>
+                <w:bCs/>
               </w:rPr>
               <w:t>- Desarrollo de Software</w:t>
             </w:r>
@@ -1131,12 +1131,12 @@
               <w:spacing w:line="240" w:lineRule="auto"/>
               <w:jc w:val="both"/>
               <w:rPr>
-                <w:b/>
-              </w:rPr>
-            </w:pPr>
-            <w:r>
-              <w:rPr>
-                <w:b/>
+                <w:bCs/>
+              </w:rPr>
+            </w:pPr>
+            <w:r>
+              <w:rPr>
+                <w:bCs/>
               </w:rPr>
               <w:t>- Bases de Datos</w:t>
             </w:r>
@@ -1146,12 +1146,12 @@
               <w:spacing w:line="240" w:lineRule="auto"/>
               <w:jc w:val="both"/>
               <w:rPr>
-                <w:b/>
-              </w:rPr>
-            </w:pPr>
-            <w:r>
-              <w:rPr>
-                <w:b/>
+                <w:bCs/>
+              </w:rPr>
+            </w:pPr>
+            <w:r>
+              <w:rPr>
+                <w:bCs/>
               </w:rPr>
               <w:t>- Machine Learning</w:t>
             </w:r>
@@ -1204,16 +1204,8 @@
             <w:pPr>
               <w:spacing w:line="240" w:lineRule="auto"/>
               <w:jc w:val="both"/>
-              <w:rPr>
-                <w:b/>
-                <w:bCs/>
-              </w:rPr>
-            </w:pPr>
-            <w:r>
-              <w:rPr>
-                <w:b/>
-                <w:bCs/>
-              </w:rPr>
+            </w:pPr>
+            <w:r>
               <w:t>- Ofrecer propuestas de solución informática analizando de forma integral los procesos de acuerdo a los requerimientos de la organización.</w:t>
             </w:r>
           </w:p>
@@ -1221,16 +1213,8 @@
             <w:pPr>
               <w:spacing w:line="240" w:lineRule="auto"/>
               <w:jc w:val="both"/>
-              <w:rPr>
-                <w:b/>
-                <w:bCs/>
-              </w:rPr>
-            </w:pPr>
-            <w:r>
-              <w:rPr>
-                <w:b/>
-                <w:bCs/>
-              </w:rPr>
+            </w:pPr>
+            <w:r>
               <w:t>- Desarrollar una solución de software utilizando técnicas que permitan sistematizar el proceso de desarrollo y mantenimiento, asegurando el logro de los objetivos.</w:t>
             </w:r>
           </w:p>
@@ -1238,16 +1222,8 @@
             <w:pPr>
               <w:spacing w:line="240" w:lineRule="auto"/>
               <w:jc w:val="both"/>
-              <w:rPr>
-                <w:b/>
-                <w:bCs/>
-              </w:rPr>
-            </w:pPr>
-            <w:r>
-              <w:rPr>
-                <w:b/>
-                <w:bCs/>
-              </w:rPr>
+            </w:pPr>
+            <w:r>
               <w:lastRenderedPageBreak/>
               <w:t>- Construir Modelos de datos para soportar los requerimientos de la organización de acuerdo a un diseño definido y escalable en el tiempo.</w:t>
             </w:r>
@@ -1256,16 +1232,8 @@
             <w:pPr>
               <w:spacing w:line="240" w:lineRule="auto"/>
               <w:jc w:val="both"/>
-              <w:rPr>
-                <w:b/>
-                <w:bCs/>
-              </w:rPr>
-            </w:pPr>
-            <w:r>
-              <w:rPr>
-                <w:b/>
-                <w:bCs/>
-              </w:rPr>
+            </w:pPr>
+            <w:r>
               <w:t>- Programar consultas o rutinas para manipular información de una base de datos de acuerdo a los requerimientos de la organización.</w:t>
             </w:r>
           </w:p>
@@ -1273,16 +1241,8 @@
             <w:pPr>
               <w:spacing w:line="240" w:lineRule="auto"/>
               <w:jc w:val="both"/>
-              <w:rPr>
-                <w:b/>
-                <w:bCs/>
-              </w:rPr>
-            </w:pPr>
-            <w:r>
-              <w:rPr>
-                <w:b/>
-                <w:bCs/>
-              </w:rPr>
+            </w:pPr>
+            <w:r>
               <w:t>- Construir programas y rutinas de variada complejidad para dar solución a requerimientos de la organización, acordes a tecnologías de mercado y utilizando buenas prácticas de codificación.</w:t>
             </w:r>
           </w:p>
@@ -1290,16 +1250,8 @@
             <w:pPr>
               <w:spacing w:line="240" w:lineRule="auto"/>
               <w:jc w:val="both"/>
-              <w:rPr>
-                <w:b/>
-                <w:bCs/>
-              </w:rPr>
-            </w:pPr>
-            <w:r>
-              <w:rPr>
-                <w:b/>
-                <w:bCs/>
-              </w:rPr>
+            </w:pPr>
+            <w:r>
               <w:t>- Realizar pruebas de certificación tanto de los productos como de los procesos utilizando buenas prácticas definidas por la industria.</w:t>
             </w:r>
           </w:p>
@@ -1307,16 +1259,8 @@
             <w:pPr>
               <w:spacing w:line="240" w:lineRule="auto"/>
               <w:jc w:val="both"/>
-              <w:rPr>
-                <w:b/>
-                <w:bCs/>
-              </w:rPr>
-            </w:pPr>
-            <w:r>
-              <w:rPr>
-                <w:b/>
-                <w:bCs/>
-              </w:rPr>
+            </w:pPr>
+            <w:r>
               <w:t>- Construir el modelo arquitectónico de una solución sistémica que soporte los procesos de negocio de acuerdo a los requerimientos de la organización y estándares de la industria.</w:t>
             </w:r>
           </w:p>
@@ -1324,16 +1268,8 @@
             <w:pPr>
               <w:spacing w:line="240" w:lineRule="auto"/>
               <w:jc w:val="both"/>
-              <w:rPr>
-                <w:b/>
-                <w:bCs/>
-              </w:rPr>
-            </w:pPr>
-            <w:r>
-              <w:rPr>
-                <w:b/>
-                <w:bCs/>
-              </w:rPr>
+            </w:pPr>
+            <w:r>
               <w:t>- Implementar soluciones sistémicas integrales para automatizar u optimizar procesos de negocio de acuerdo a las necesidades de la organización.</w:t>
             </w:r>
           </w:p>
@@ -1341,16 +1277,8 @@
             <w:pPr>
               <w:spacing w:line="240" w:lineRule="auto"/>
               <w:jc w:val="both"/>
-              <w:rPr>
-                <w:b/>
-                <w:bCs/>
-              </w:rPr>
-            </w:pPr>
-            <w:r>
-              <w:rPr>
-                <w:b/>
-                <w:bCs/>
-              </w:rPr>
+            </w:pPr>
+            <w:r>
               <w:t>- Gestionar proyectos informáticos, ofreciendo alternativas para la toma de decisiones de acuerdo a los requerimientos de la organización.</w:t>
             </w:r>
           </w:p>
@@ -1539,16 +1467,12 @@
               <w:jc w:val="both"/>
               <w:rPr>
                 <w:rFonts w:ascii="Calibri" w:hAnsi="Calibri" w:cs="Calibri"/>
-                <w:b/>
-                <w:bCs/>
                 <w:lang w:eastAsia="es-CL"/>
               </w:rPr>
             </w:pPr>
             <w:r>
               <w:rPr>
                 <w:rFonts w:ascii="Calibri" w:hAnsi="Calibri" w:cs="Calibri"/>
-                <w:b/>
-                <w:bCs/>
                 <w:lang w:eastAsia="es-CL"/>
               </w:rPr>
               <w:t>Actualmente, el control de acceso vehicular en condominios y edificios habitacionales en Chile se resuelve mediante controles remotos inalámbricos o mediante la verificación manual de personal de seguridad. Ambos mecanismos comparten el mismo problema: el acceso no se valida contra un registro objetivo de quién debería ingresar, sino que depende de la posesión de un dispositivo o del criterio de una persona, lo que los hace vulnerables a pérdida, robo, préstamo no autorizado o simple error humano.</w:t>
@@ -1560,16 +1484,12 @@
               <w:jc w:val="both"/>
               <w:rPr>
                 <w:rFonts w:ascii="Calibri" w:hAnsi="Calibri" w:cs="Calibri"/>
-                <w:b/>
-                <w:bCs/>
                 <w:lang w:eastAsia="es-CL"/>
               </w:rPr>
             </w:pPr>
             <w:r>
               <w:rPr>
                 <w:rFonts w:ascii="Calibri" w:hAnsi="Calibri" w:cs="Calibri"/>
-                <w:b/>
-                <w:bCs/>
                 <w:lang w:eastAsia="es-CL"/>
               </w:rPr>
               <w:t>Elegimos este tema porque uno de los integrantes del equipo se desempeña en el ámbito de la seguridad pública, lo que le ha permitido observar de forma directa estas carencias en organizaciones privadas.</w:t>
@@ -1581,16 +1501,12 @@
               <w:jc w:val="both"/>
               <w:rPr>
                 <w:rFonts w:ascii="Calibri" w:hAnsi="Calibri" w:cs="Calibri"/>
-                <w:b/>
-                <w:bCs/>
                 <w:lang w:eastAsia="es-CL"/>
               </w:rPr>
             </w:pPr>
             <w:r>
               <w:rPr>
                 <w:rFonts w:ascii="Calibri" w:hAnsi="Calibri" w:cs="Calibri"/>
-                <w:b/>
-                <w:bCs/>
                 <w:lang w:eastAsia="es-CL"/>
               </w:rPr>
               <w:t>Este proyecto es relevante para el campo laboral de la Ingeniería en Informática porque integra áreas centrales de la disciplina reconocimiento de imágenes mediante Machine Learning, diseño de bases de datos y arquitectura de sistemas aplicadas a la resolución de un problema real de seguridad, un ámbito donde la industria demanda cada vez más soluciones tecnológicas que reemplacen procesos manuales o dispositivos físicos por sistemas automatizados y verificables.</w:t>
@@ -1602,29 +1518,23 @@
               <w:jc w:val="both"/>
               <w:rPr>
                 <w:rFonts w:ascii="Calibri" w:hAnsi="Calibri" w:cs="Calibri"/>
-                <w:b/>
-                <w:bCs/>
                 <w:lang w:eastAsia="es-CL"/>
               </w:rPr>
             </w:pPr>
             <w:r>
               <w:rPr>
                 <w:rFonts w:ascii="Calibri" w:hAnsi="Calibri" w:cs="Calibri"/>
-                <w:b/>
-                <w:bCs/>
-                <w:lang w:eastAsia="es-CL"/>
-              </w:rPr>
-              <w:t xml:space="preserve">La problemática se sitúa a nivel nacional, considerando el crecimiento sostenido de la vivienda en condominios y edificios de departamentos como </w:t>
+                <w:lang w:eastAsia="es-CL"/>
+              </w:rPr>
+              <w:t xml:space="preserve">La problemática se sitúa a nivel nacional, considerando el crecimiento sostenido de la vivienda en condominios y edificios de departamentos como modelo habitacional en Chile, lo que ha masificado el uso de estos mismos </w:t>
             </w:r>
             <w:r>
               <w:rPr>
                 <w:rFonts w:ascii="Calibri" w:hAnsi="Calibri" w:cs="Calibri"/>
-                <w:b/>
-                <w:bCs/>
                 <w:lang w:eastAsia="es-CL"/>
               </w:rPr>
               <w:lastRenderedPageBreak/>
-              <w:t>modelo habitacional en Chile, lo que ha masificado el uso de estos mismos mecanismos de control de acceso en prácticamente todo el país, independiente de la región. Los principales afectados son los residentes de condominios y edificios habitacionales, sin distinción de región ni tipo de comunidad.</w:t>
+              <w:t>mecanismos de control de acceso en prácticamente todo el país, independiente de la región. Los principales afectados son los residentes de condominios y edificios habitacionales, sin distinción de región ni tipo de comunidad.</w:t>
             </w:r>
           </w:p>
           <w:p>
@@ -1633,8 +1543,6 @@
               <w:jc w:val="both"/>
               <w:rPr>
                 <w:rFonts w:ascii="Calibri" w:hAnsi="Calibri" w:cs="Calibri"/>
-                <w:b/>
-                <w:bCs/>
                 <w:color w:val="548DD4"/>
                 <w:lang w:eastAsia="es-CL"/>
               </w:rPr>
@@ -1642,8 +1550,6 @@
             <w:r>
               <w:rPr>
                 <w:rFonts w:ascii="Calibri" w:hAnsi="Calibri" w:cs="Calibri"/>
-                <w:b/>
-                <w:bCs/>
                 <w:lang w:eastAsia="es-CL"/>
               </w:rPr>
               <w:t>El proyecto propone un sistema de control de acceso basado en el reconocimiento automático de patentes vehiculares, donde el ingreso se valida contra los vehículos previamente registrados en la base de datos del recinto, eliminando la dependencia de un dispositivo físico o del criterio manual de una persona. Además, permite gestionar el acceso de visitas: el propio residente registra el vehículo de la visita, habilitando su ingreso por un período acotado de 24 horas. El aporte de valor es doble: mejora objetivamente la seguridad al automatizar la verificación de ingreso, y al estar diseñado sobre hardware de bajo costo, lo hace una alternativa viable también para condominios con recursos limitados, no solo para comunidades de alto presupuesto.</w:t>
@@ -1697,8 +1603,6 @@
               <w:jc w:val="both"/>
               <w:rPr>
                 <w:rFonts w:ascii="Calibri" w:hAnsi="Calibri" w:cs="Arial"/>
-                <w:b/>
-                <w:bCs/>
                 <w:iCs/>
                 <w:lang w:eastAsia="es-CL"/>
               </w:rPr>
@@ -1706,8 +1610,6 @@
             <w:r>
               <w:rPr>
                 <w:rFonts w:ascii="Calibri" w:hAnsi="Calibri" w:cs="Arial"/>
-                <w:b/>
-                <w:bCs/>
                 <w:iCs/>
                 <w:lang w:eastAsia="es-CL"/>
               </w:rPr>
@@ -1720,8 +1622,6 @@
               <w:jc w:val="both"/>
               <w:rPr>
                 <w:rFonts w:ascii="Calibri" w:hAnsi="Calibri" w:cs="Arial"/>
-                <w:b/>
-                <w:bCs/>
                 <w:iCs/>
                 <w:lang w:eastAsia="es-CL"/>
               </w:rPr>
@@ -1729,8 +1629,6 @@
             <w:r>
               <w:rPr>
                 <w:rFonts w:ascii="Calibri" w:hAnsi="Calibri" w:cs="Arial"/>
-                <w:b/>
-                <w:bCs/>
                 <w:iCs/>
                 <w:lang w:eastAsia="es-CL"/>
               </w:rPr>
@@ -1739,8 +1637,6 @@
             <w:r>
               <w:rPr>
                 <w:rFonts w:ascii="Calibri" w:hAnsi="Calibri" w:cs="Arial"/>
-                <w:b/>
-                <w:bCs/>
                 <w:iCs/>
                 <w:lang w:eastAsia="es-CL"/>
               </w:rPr>
@@ -1749,8 +1645,6 @@
             <w:r>
               <w:rPr>
                 <w:rFonts w:ascii="Calibri" w:hAnsi="Calibri" w:cs="Arial"/>
-                <w:b/>
-                <w:bCs/>
                 <w:iCs/>
                 <w:lang w:eastAsia="es-CL"/>
               </w:rPr>
@@ -1763,8 +1657,6 @@
               <w:jc w:val="both"/>
               <w:rPr>
                 <w:rFonts w:ascii="Calibri" w:hAnsi="Calibri" w:cs="Arial"/>
-                <w:b/>
-                <w:bCs/>
                 <w:iCs/>
                 <w:lang w:eastAsia="es-CL"/>
               </w:rPr>
@@ -1772,8 +1664,6 @@
             <w:r>
               <w:rPr>
                 <w:rFonts w:ascii="Calibri" w:hAnsi="Calibri" w:cs="Arial"/>
-                <w:b/>
-                <w:bCs/>
                 <w:iCs/>
                 <w:lang w:eastAsia="es-CL"/>
               </w:rPr>
@@ -1783,8 +1673,6 @@
             <w:r>
               <w:rPr>
                 <w:rFonts w:ascii="Calibri" w:hAnsi="Calibri" w:cs="Arial"/>
-                <w:b/>
-                <w:bCs/>
                 <w:iCs/>
                 <w:lang w:eastAsia="es-CL"/>
               </w:rPr>
@@ -1794,8 +1682,6 @@
             <w:r>
               <w:rPr>
                 <w:rFonts w:ascii="Calibri" w:hAnsi="Calibri" w:cs="Arial"/>
-                <w:b/>
-                <w:bCs/>
                 <w:iCs/>
                 <w:lang w:eastAsia="es-CL"/>
               </w:rPr>
@@ -1817,22 +1703,10 @@
             <w:r>
               <w:rPr>
                 <w:rFonts w:ascii="Calibri" w:hAnsi="Calibri" w:cs="Arial"/>
-                <w:b/>
-                <w:bCs/>
                 <w:iCs/>
                 <w:lang w:eastAsia="es-CL"/>
               </w:rPr>
-              <w:t>El desarrollo del proyecto se aborda bajo una metodología ágil (Scrum), organizada en sprints, dado que gran parte de las tareas entrenamiento del modelo de Machine Learning y desarrollo de la aplicación web pueden avanzar en paralelo entre ambos integrantes hasta la etapa de integración final.</w:t>
-            </w:r>
-            <w:r>
-              <w:rPr>
-                <w:rFonts w:ascii="Calibri" w:hAnsi="Calibri" w:cs="Arial"/>
-                <w:b/>
-                <w:bCs/>
-                <w:iCs/>
-                <w:lang w:eastAsia="es-CL"/>
-              </w:rPr>
-              <w:t xml:space="preserve"> </w:t>
+              <w:t xml:space="preserve">El desarrollo del proyecto se aborda bajo una metodología ágil (Scrum), organizada en sprints, dado que gran parte de las tareas entrenamiento del modelo de Machine Learning y desarrollo de la aplicación web pueden avanzar en paralelo entre ambos integrantes hasta la etapa de integración final. </w:t>
             </w:r>
           </w:p>
         </w:tc>
@@ -1882,8 +1756,6 @@
               <w:jc w:val="both"/>
               <w:rPr>
                 <w:rFonts w:ascii="Calibri" w:hAnsi="Calibri" w:cs="Arial"/>
-                <w:b/>
-                <w:bCs/>
                 <w:i/>
                 <w:lang w:eastAsia="es-CL"/>
               </w:rPr>
@@ -1891,33 +1763,27 @@
             <w:r>
               <w:rPr>
                 <w:rFonts w:ascii="Calibri" w:hAnsi="Calibri" w:cs="Arial"/>
-                <w:b/>
-                <w:bCs/>
                 <w:iCs/>
                 <w:lang w:eastAsia="es-CL"/>
               </w:rPr>
-              <w:t xml:space="preserve">SegurIA LPR se relaciona directamente con competencias centrales del perfil de egreso de Ingeniería en Informática, particularmente en lo referido al desarrollo de software, la construcción y administración de modelos de </w:t>
-            </w:r>
-            <w:r>
-              <w:rPr>
-                <w:rFonts w:ascii="Calibri" w:hAnsi="Calibri" w:cs="Arial"/>
-                <w:b/>
-                <w:bCs/>
+              <w:t xml:space="preserve">SegurIA LPR se relaciona directamente con competencias centrales del perfil de egreso de Ingeniería en Informática, particularmente en lo referido al desarrollo de software, la construcción y administración de modelos de datos, y el diseño de arquitectura de sistemas. El proyecto exige levantar y modelar </w:t>
+            </w:r>
+            <w:r>
+              <w:rPr>
+                <w:rFonts w:ascii="Calibri" w:hAnsi="Calibri" w:cs="Arial"/>
                 <w:iCs/>
                 <w:lang w:eastAsia="es-CL"/>
               </w:rPr>
               <w:lastRenderedPageBreak/>
-              <w:t>datos, y el diseño de arquitectura de sistemas. El proyecto exige levantar y modelar una base de datos relacional que sostenga la operación multi-tenant del sistema, además del desarrollo completo de una aplicación web con distintos niveles de acceso según rol de usuario, lo que pone en práctica de forma integral estas competencias.</w:t>
-            </w:r>
-          </w:p>
-          <w:p>
-            <w:pPr>
-              <w:spacing w:line="240" w:lineRule="auto"/>
-              <w:jc w:val="both"/>
-              <w:rPr>
-                <w:rFonts w:ascii="Calibri" w:hAnsi="Calibri" w:cs="Arial"/>
-                <w:b/>
-                <w:bCs/>
+              <w:t>una base de datos relacional que sostenga la operación multi-tenant del sistema, además del desarrollo completo de una aplicación web con distintos niveles de acceso según rol de usuario, lo que pone en práctica de forma integral estas competencias.</w:t>
+            </w:r>
+          </w:p>
+          <w:p>
+            <w:pPr>
+              <w:spacing w:line="240" w:lineRule="auto"/>
+              <w:jc w:val="both"/>
+              <w:rPr>
+                <w:rFonts w:ascii="Calibri" w:hAnsi="Calibri" w:cs="Arial"/>
                 <w:iCs/>
                 <w:sz w:val="20"/>
                 <w:szCs w:val="20"/>
@@ -1927,8 +1793,6 @@
             <w:r>
               <w:rPr>
                 <w:rFonts w:ascii="Calibri" w:hAnsi="Calibri" w:cs="Arial"/>
-                <w:b/>
-                <w:bCs/>
                 <w:iCs/>
                 <w:lang w:eastAsia="es-CL"/>
               </w:rPr>
@@ -1937,8 +1801,6 @@
             <w:r>
               <w:rPr>
                 <w:rFonts w:ascii="Calibri" w:hAnsi="Calibri" w:cs="Arial"/>
-                <w:b/>
-                <w:bCs/>
                 <w:iCs/>
                 <w:lang w:eastAsia="es-CL"/>
               </w:rPr>
@@ -1947,8 +1809,6 @@
             <w:r>
               <w:rPr>
                 <w:rFonts w:ascii="Calibri" w:hAnsi="Calibri" w:cs="Arial"/>
-                <w:b/>
-                <w:bCs/>
                 <w:iCs/>
                 <w:lang w:eastAsia="es-CL"/>
               </w:rPr>
@@ -1996,8 +1856,6 @@
               <w:jc w:val="both"/>
               <w:rPr>
                 <w:rFonts w:ascii="Calibri" w:hAnsi="Calibri" w:cs="Arial"/>
-                <w:b/>
-                <w:bCs/>
                 <w:iCs/>
                 <w:lang w:eastAsia="es-CL"/>
               </w:rPr>
@@ -2005,8 +1863,6 @@
             <w:r>
               <w:rPr>
                 <w:rFonts w:ascii="Calibri" w:hAnsi="Calibri" w:cs="Arial"/>
-                <w:b/>
-                <w:bCs/>
                 <w:iCs/>
                 <w:lang w:eastAsia="es-CL"/>
               </w:rPr>
@@ -2019,8 +1875,6 @@
               <w:jc w:val="both"/>
               <w:rPr>
                 <w:rFonts w:ascii="Calibri" w:hAnsi="Calibri" w:cs="Arial"/>
-                <w:b/>
-                <w:bCs/>
                 <w:iCs/>
                 <w:lang w:eastAsia="es-CL"/>
               </w:rPr>
@@ -2028,8 +1882,6 @@
             <w:r>
               <w:rPr>
                 <w:rFonts w:ascii="Calibri" w:hAnsi="Calibri" w:cs="Arial"/>
-                <w:b/>
-                <w:bCs/>
                 <w:iCs/>
                 <w:lang w:eastAsia="es-CL"/>
               </w:rPr>
@@ -2042,8 +1894,6 @@
               <w:jc w:val="both"/>
               <w:rPr>
                 <w:rFonts w:ascii="Calibri" w:hAnsi="Calibri" w:cs="Arial"/>
-                <w:b/>
-                <w:bCs/>
                 <w:iCs/>
                 <w:sz w:val="20"/>
                 <w:szCs w:val="20"/>
@@ -2053,12 +1903,26 @@
             <w:r>
               <w:rPr>
                 <w:rFonts w:ascii="Calibri" w:hAnsi="Calibri" w:cs="Arial"/>
-                <w:b/>
-                <w:bCs/>
                 <w:iCs/>
                 <w:lang w:eastAsia="es-CL"/>
               </w:rPr>
-              <w:t>Desarrollar este Proyecto APT contribuye a nuestro desarrollo profesional al enfrentarnos a un problema real, con datos reales y limitaciones reales (de costo, de recursos y de contexto), en lugar de un escenario simulado o simplificado. Esto consolida nuestra capacidad de aplicar Machine Learning más allá de la teoría, validando su desempeño frente a la realidad y comprendiendo las implicancias de que un sistema de este tipo funcione de manera confiable en un entorno de uso cotidiano.</w:t>
+              <w:t xml:space="preserve">Desarrollar este Proyecto APT contribuye a nuestro desarrollo profesional al enfrentarnos a un problema real, con </w:t>
+            </w:r>
+            <w:r>
+              <w:rPr>
+                <w:rFonts w:ascii="Calibri" w:hAnsi="Calibri" w:cs="Arial"/>
+                <w:iCs/>
+                <w:lang w:eastAsia="es-CL"/>
+              </w:rPr>
+              <w:t>datos y limitaciones reales</w:t>
+            </w:r>
+            <w:r>
+              <w:rPr>
+                <w:rFonts w:ascii="Calibri" w:hAnsi="Calibri" w:cs="Arial"/>
+                <w:iCs/>
+                <w:lang w:eastAsia="es-CL"/>
+              </w:rPr>
+              <w:t xml:space="preserve"> (de costo, de recursos y de contexto), en lugar de un escenario simulado o simplificado. Esto consolida nuestra capacidad de aplicar Machine Learning más allá de la teoría, validando su desempeño frente a la realidad y comprendiendo las implicancias de que un sistema de este tipo funcione de manera confiable en un entorno de uso cotidiano.</w:t>
             </w:r>
           </w:p>
         </w:tc>
@@ -2101,8 +1965,6 @@
               <w:jc w:val="both"/>
               <w:rPr>
                 <w:rFonts w:ascii="Calibri" w:hAnsi="Calibri" w:cs="Arial"/>
-                <w:b/>
-                <w:bCs/>
                 <w:iCs/>
                 <w:lang w:eastAsia="es-CL"/>
               </w:rPr>
@@ -2110,8 +1972,6 @@
             <w:r>
               <w:rPr>
                 <w:rFonts w:ascii="Calibri" w:hAnsi="Calibri" w:cs="Arial"/>
-                <w:b/>
-                <w:bCs/>
                 <w:iCs/>
                 <w:lang w:eastAsia="es-CL"/>
               </w:rPr>
@@ -2124,8 +1984,6 @@
               <w:jc w:val="both"/>
               <w:rPr>
                 <w:rFonts w:ascii="Calibri" w:hAnsi="Calibri" w:cs="Arial"/>
-                <w:b/>
-                <w:bCs/>
                 <w:iCs/>
                 <w:lang w:eastAsia="es-CL"/>
               </w:rPr>
@@ -2133,33 +1991,27 @@
             <w:r>
               <w:rPr>
                 <w:rFonts w:ascii="Calibri" w:hAnsi="Calibri" w:cs="Arial"/>
-                <w:b/>
-                <w:bCs/>
                 <w:iCs/>
                 <w:lang w:eastAsia="es-CL"/>
               </w:rPr>
-              <w:t xml:space="preserve">El periodo académico contempla 18 semanas de desarrollo, distribuidas en las tres fases de la asignatura Capstone: Fase 1 (semanas 1 a 4, definición del proyecto), Fase 2 (semanas 5 a 15, desarrollo) y Fase 3 (semanas 16 a 18, presentación final). Esta duración es suficiente para completar el alcance </w:t>
-            </w:r>
-            <w:r>
-              <w:rPr>
-                <w:rFonts w:ascii="Calibri" w:hAnsi="Calibri" w:cs="Arial"/>
-                <w:b/>
-                <w:bCs/>
+              <w:t xml:space="preserve">El periodo académico contempla 18 semanas de desarrollo, distribuidas en las tres fases de la asignatura Capstone: Fase 1 (semanas 1 a 4, definición del proyecto), Fase 2 (semanas 5 a 15, desarrollo) y Fase 3 (semanas 16 a 18, presentación final). Esta duración es suficiente para completar el alcance definido del proyecto, considerando que el entrenamiento del modelo de Machine Learning la etapa de mayor dependencia técnica se estima en 3 a 4 </w:t>
+            </w:r>
+            <w:r>
+              <w:rPr>
+                <w:rFonts w:ascii="Calibri" w:hAnsi="Calibri" w:cs="Arial"/>
                 <w:iCs/>
                 <w:lang w:eastAsia="es-CL"/>
               </w:rPr>
               <w:lastRenderedPageBreak/>
-              <w:t>definido del proyecto, considerando que el entrenamiento del modelo de Machine Learning la etapa de mayor dependencia técnica se estima en 3 a 4 semanas, dejando el resto del período disponible para el desarrollo de la plataforma, la integración de cámaras y las pruebas del sistema.</w:t>
-            </w:r>
-          </w:p>
-          <w:p>
-            <w:pPr>
-              <w:spacing w:line="240" w:lineRule="auto"/>
-              <w:jc w:val="both"/>
-              <w:rPr>
-                <w:rFonts w:ascii="Calibri" w:hAnsi="Calibri" w:cs="Arial"/>
-                <w:b/>
-                <w:bCs/>
+              <w:t>semanas, dejando el resto del período disponible para el desarrollo de la plataforma, la integración de cámaras y las pruebas del sistema.</w:t>
+            </w:r>
+          </w:p>
+          <w:p>
+            <w:pPr>
+              <w:spacing w:line="240" w:lineRule="auto"/>
+              <w:jc w:val="both"/>
+              <w:rPr>
+                <w:rFonts w:ascii="Calibri" w:hAnsi="Calibri" w:cs="Arial"/>
                 <w:iCs/>
                 <w:lang w:eastAsia="es-CL"/>
               </w:rPr>
@@ -2167,8 +2019,6 @@
             <w:r>
               <w:rPr>
                 <w:rFonts w:ascii="Calibri" w:hAnsi="Calibri" w:cs="Arial"/>
-                <w:b/>
-                <w:bCs/>
                 <w:iCs/>
                 <w:lang w:eastAsia="es-CL"/>
               </w:rPr>
@@ -2181,8 +2031,6 @@
               <w:jc w:val="both"/>
               <w:rPr>
                 <w:rFonts w:ascii="Calibri" w:hAnsi="Calibri" w:cs="Arial"/>
-                <w:b/>
-                <w:bCs/>
                 <w:iCs/>
                 <w:lang w:eastAsia="es-CL"/>
               </w:rPr>
@@ -2190,8 +2038,6 @@
             <w:r>
               <w:rPr>
                 <w:rFonts w:ascii="Calibri" w:hAnsi="Calibri" w:cs="Arial"/>
-                <w:b/>
-                <w:bCs/>
                 <w:iCs/>
                 <w:lang w:eastAsia="es-CL"/>
               </w:rPr>
@@ -2204,8 +2050,6 @@
               <w:jc w:val="both"/>
               <w:rPr>
                 <w:rFonts w:ascii="Calibri" w:hAnsi="Calibri" w:cs="Arial"/>
-                <w:b/>
-                <w:bCs/>
                 <w:iCs/>
                 <w:lang w:eastAsia="es-CL"/>
               </w:rPr>
@@ -2213,8 +2057,6 @@
             <w:r>
               <w:rPr>
                 <w:rFonts w:ascii="Calibri" w:hAnsi="Calibri" w:cs="Arial"/>
-                <w:b/>
-                <w:bCs/>
                 <w:iCs/>
                 <w:lang w:eastAsia="es-CL"/>
               </w:rPr>
@@ -2227,8 +2069,6 @@
               <w:jc w:val="both"/>
               <w:rPr>
                 <w:rFonts w:ascii="Calibri" w:hAnsi="Calibri" w:cs="Arial"/>
-                <w:b/>
-                <w:bCs/>
                 <w:iCs/>
                 <w:lang w:eastAsia="es-CL"/>
               </w:rPr>
@@ -2236,19 +2076,55 @@
             <w:r>
               <w:rPr>
                 <w:rFonts w:ascii="Calibri" w:hAnsi="Calibri" w:cs="Arial"/>
-                <w:b/>
-                <w:bCs/>
                 <w:iCs/>
                 <w:lang w:eastAsia="es-CL"/>
               </w:rPr>
-              <w:t xml:space="preserve">Los materiales necesarios para el desarrollo del proyecto son de bajo costo y de fácil acceso: una cámara IP de uso doméstico (TP-Link Tapo C310, con soporte RTSP/ONVIF), los computadores personales de cada integrante para el desarrollo y entrenamiento del modelo, y herramientas de software de uso gratuito (YOLOv8, </w:t>
+              <w:t>Los materiales necesarios para el desarrollo del proyecto son de bajo costo y de fácil acceso:</w:t>
+            </w:r>
+            <w:r>
+              <w:rPr>
+                <w:rFonts w:ascii="Calibri" w:hAnsi="Calibri" w:cs="Arial"/>
+                <w:iCs/>
+                <w:lang w:eastAsia="es-CL"/>
+              </w:rPr>
+              <w:t xml:space="preserve"> Cámara</w:t>
+            </w:r>
+            <w:r>
+              <w:rPr>
+                <w:rFonts w:ascii="Calibri" w:hAnsi="Calibri" w:cs="Arial"/>
+                <w:iCs/>
+                <w:lang w:eastAsia="es-CL"/>
+              </w:rPr>
+              <w:t xml:space="preserve"> IP TP-Link Tapo C310</w:t>
+            </w:r>
+            <w:r>
+              <w:rPr>
+                <w:rFonts w:ascii="Calibri" w:hAnsi="Calibri" w:cs="Arial"/>
+                <w:iCs/>
+                <w:lang w:eastAsia="es-CL"/>
+              </w:rPr>
+              <w:t>,</w:t>
+            </w:r>
+            <w:r>
+              <w:rPr>
+                <w:rFonts w:ascii="Calibri" w:hAnsi="Calibri" w:cs="Arial"/>
+                <w:iCs/>
+                <w:lang w:eastAsia="es-CL"/>
+              </w:rPr>
+              <w:t xml:space="preserve"> Raspberry Pi 4 de 4 GB</w:t>
+            </w:r>
+            <w:r>
+              <w:rPr>
+                <w:rFonts w:ascii="Calibri" w:hAnsi="Calibri" w:cs="Arial"/>
+                <w:iCs/>
+                <w:lang w:eastAsia="es-CL"/>
+              </w:rPr>
+              <w:t xml:space="preserve">, y herramientas de software de uso gratuito (YOLOv8, </w:t>
             </w:r>
             <w:proofErr w:type="spellStart"/>
             <w:r>
               <w:rPr>
                 <w:rFonts w:ascii="Calibri" w:hAnsi="Calibri" w:cs="Arial"/>
-                <w:b/>
-                <w:bCs/>
                 <w:iCs/>
                 <w:lang w:eastAsia="es-CL"/>
               </w:rPr>
@@ -2258,8 +2134,6 @@
             <w:r>
               <w:rPr>
                 <w:rFonts w:ascii="Calibri" w:hAnsi="Calibri" w:cs="Arial"/>
-                <w:b/>
-                <w:bCs/>
                 <w:iCs/>
                 <w:lang w:eastAsia="es-CL"/>
               </w:rPr>
@@ -2269,8 +2143,6 @@
             <w:r>
               <w:rPr>
                 <w:rFonts w:ascii="Calibri" w:hAnsi="Calibri" w:cs="Arial"/>
-                <w:b/>
-                <w:bCs/>
                 <w:iCs/>
                 <w:lang w:eastAsia="es-CL"/>
               </w:rPr>
@@ -2280,8 +2152,6 @@
             <w:r>
               <w:rPr>
                 <w:rFonts w:ascii="Calibri" w:hAnsi="Calibri" w:cs="Arial"/>
-                <w:b/>
-                <w:bCs/>
                 <w:iCs/>
                 <w:lang w:eastAsia="es-CL"/>
               </w:rPr>
@@ -2291,8 +2161,6 @@
             <w:r>
               <w:rPr>
                 <w:rFonts w:ascii="Calibri" w:hAnsi="Calibri" w:cs="Arial"/>
-                <w:b/>
-                <w:bCs/>
                 <w:iCs/>
                 <w:lang w:eastAsia="es-CL"/>
               </w:rPr>
@@ -2302,8 +2170,6 @@
             <w:r>
               <w:rPr>
                 <w:rFonts w:ascii="Calibri" w:hAnsi="Calibri" w:cs="Arial"/>
-                <w:b/>
-                <w:bCs/>
                 <w:iCs/>
                 <w:lang w:eastAsia="es-CL"/>
               </w:rPr>
@@ -2316,8 +2182,6 @@
               <w:jc w:val="both"/>
               <w:rPr>
                 <w:rFonts w:ascii="Calibri" w:hAnsi="Calibri" w:cs="Arial"/>
-                <w:b/>
-                <w:bCs/>
                 <w:iCs/>
                 <w:lang w:eastAsia="es-CL"/>
               </w:rPr>
@@ -2325,8 +2189,6 @@
             <w:r>
               <w:rPr>
                 <w:rFonts w:ascii="Calibri" w:hAnsi="Calibri" w:cs="Arial"/>
-                <w:b/>
-                <w:bCs/>
                 <w:iCs/>
                 <w:lang w:eastAsia="es-CL"/>
               </w:rPr>
@@ -2339,8 +2201,6 @@
               <w:jc w:val="both"/>
               <w:rPr>
                 <w:rFonts w:ascii="Calibri" w:hAnsi="Calibri" w:cs="Arial"/>
-                <w:b/>
-                <w:bCs/>
                 <w:iCs/>
                 <w:lang w:eastAsia="es-CL"/>
               </w:rPr>
@@ -2348,8 +2208,6 @@
             <w:r>
               <w:rPr>
                 <w:rFonts w:ascii="Calibri" w:hAnsi="Calibri" w:cs="Arial"/>
-                <w:b/>
-                <w:bCs/>
                 <w:iCs/>
                 <w:lang w:eastAsia="es-CL"/>
               </w:rPr>
@@ -2359,8 +2217,6 @@
             <w:r>
               <w:rPr>
                 <w:rFonts w:ascii="Calibri" w:hAnsi="Calibri" w:cs="Arial"/>
-                <w:b/>
-                <w:bCs/>
                 <w:iCs/>
                 <w:lang w:eastAsia="es-CL"/>
               </w:rPr>
@@ -2370,8 +2226,6 @@
             <w:r>
               <w:rPr>
                 <w:rFonts w:ascii="Calibri" w:hAnsi="Calibri" w:cs="Arial"/>
-                <w:b/>
-                <w:bCs/>
                 <w:iCs/>
                 <w:lang w:eastAsia="es-CL"/>
               </w:rPr>
@@ -2381,8 +2235,6 @@
             <w:r>
               <w:rPr>
                 <w:rFonts w:ascii="Calibri" w:hAnsi="Calibri" w:cs="Arial"/>
-                <w:b/>
-                <w:bCs/>
                 <w:iCs/>
                 <w:lang w:eastAsia="es-CL"/>
               </w:rPr>
@@ -2392,8 +2244,6 @@
             <w:r>
               <w:rPr>
                 <w:rFonts w:ascii="Calibri" w:hAnsi="Calibri" w:cs="Arial"/>
-                <w:b/>
-                <w:bCs/>
                 <w:iCs/>
                 <w:lang w:eastAsia="es-CL"/>
               </w:rPr>
@@ -2406,8 +2256,6 @@
               <w:jc w:val="both"/>
               <w:rPr>
                 <w:rFonts w:ascii="Calibri" w:hAnsi="Calibri" w:cs="Arial"/>
-                <w:b/>
-                <w:bCs/>
                 <w:iCs/>
                 <w:lang w:eastAsia="es-CL"/>
               </w:rPr>
@@ -2415,8 +2263,6 @@
             <w:r>
               <w:rPr>
                 <w:rFonts w:ascii="Calibri" w:hAnsi="Calibri" w:cs="Arial"/>
-                <w:b/>
-                <w:bCs/>
                 <w:iCs/>
                 <w:lang w:eastAsia="es-CL"/>
               </w:rPr>
@@ -2429,8 +2275,6 @@
               <w:jc w:val="both"/>
               <w:rPr>
                 <w:rFonts w:ascii="Calibri" w:hAnsi="Calibri" w:cs="Arial"/>
-                <w:b/>
-                <w:bCs/>
                 <w:iCs/>
                 <w:lang w:eastAsia="es-CL"/>
               </w:rPr>
@@ -2438,23 +2282,10 @@
             <w:r>
               <w:rPr>
                 <w:rFonts w:ascii="Calibri" w:hAnsi="Calibri" w:cs="Arial"/>
-                <w:b/>
-                <w:bCs/>
                 <w:iCs/>
                 <w:lang w:eastAsia="es-CL"/>
               </w:rPr>
-              <w:t xml:space="preserve">El principal factor que podría dificultar el desarrollo es la limitación legal y ética respecto al uso de datos personales: fotografiar y almacenar patentes de terceros sin su consentimiento no es admisible conforme a la Ley N°19.628 sobre protección de la vida privada. Esto restringe la cantidad de patentes reales que podemos utilizar para la validación en terreno del sistema. Esta dificultad se resuelve acotando deliberadamente el alcance de la captura real a un número reducido de vehículos (2 a 3), pertenecientes a los propios integrantes del equipo o a personas que otorguen su consentimiento explícito, utilizados exclusivamente para la calibración y validación del sistema, mientras que el entrenamiento del modelo se realiza con el dataset público. De esta forma, la limitación se aborda como una </w:t>
-            </w:r>
-            <w:r>
-              <w:rPr>
-                <w:rFonts w:ascii="Calibri" w:hAnsi="Calibri" w:cs="Arial"/>
-                <w:b/>
-                <w:bCs/>
-                <w:iCs/>
-                <w:lang w:eastAsia="es-CL"/>
-              </w:rPr>
-              <w:lastRenderedPageBreak/>
-              <w:t>decisión metodológica documentada, sin comprometer el cumplimiento legal del proyecto.</w:t>
+              <w:t>El principal factor que podría dificultar el desarrollo es la limitación legal y ética respecto al uso de datos personales: fotografiar y almacenar patentes de terceros sin su consentimiento no es admisible conforme a la Ley N°19.628 sobre protección de la vida privada. Esto restringe la cantidad de patentes reales que podemos utilizar para la validación en terreno del sistema. Esta dificultad se resuelve acotando deliberadamente el alcance de la captura real a un número reducido de vehículos (2 a 3), pertenecientes a los propios integrantes del equipo o a personas que otorguen su consentimiento explícito, utilizados exclusivamente para la calibración y validación del sistema, mientras que el entrenamiento del modelo se realiza con el dataset público. De esta forma, la limitación se aborda como una decisión metodológica documentada, sin comprometer el cumplimiento legal del proyecto.</w:t>
             </w:r>
           </w:p>
         </w:tc>
@@ -2546,6 +2377,7 @@
                 <w:sz w:val="28"/>
                 <w:szCs w:val="28"/>
               </w:rPr>
+              <w:lastRenderedPageBreak/>
               <w:t>4</w:t>
             </w:r>
             <w:r>
@@ -2674,8 +2506,6 @@
               <w:jc w:val="both"/>
               <w:rPr>
                 <w:rFonts w:ascii="Calibri" w:hAnsi="Calibri" w:cs="Arial"/>
-                <w:b/>
-                <w:bCs/>
                 <w:iCs/>
                 <w:lang w:eastAsia="es-CL"/>
               </w:rPr>
@@ -2683,8 +2513,6 @@
             <w:r>
               <w:rPr>
                 <w:rFonts w:ascii="Calibri" w:hAnsi="Calibri" w:cs="Arial"/>
-                <w:b/>
-                <w:bCs/>
                 <w:iCs/>
                 <w:lang w:eastAsia="es-CL"/>
               </w:rPr>
@@ -2745,8 +2573,6 @@
               <w:jc w:val="both"/>
               <w:rPr>
                 <w:rFonts w:ascii="Calibri" w:hAnsi="Calibri" w:cs="Arial"/>
-                <w:b/>
-                <w:bCs/>
                 <w:iCs/>
                 <w:lang w:eastAsia="es-CL"/>
               </w:rPr>
@@ -2754,57 +2580,145 @@
             <w:r>
               <w:rPr>
                 <w:rFonts w:ascii="Calibri" w:hAnsi="Calibri" w:cs="Arial"/>
-                <w:b/>
-                <w:bCs/>
                 <w:iCs/>
                 <w:lang w:eastAsia="es-CL"/>
               </w:rPr>
-              <w:t>- Diseñar el modelo de datos que soporte la operación multi-tenant del sistema.</w:t>
-            </w:r>
-          </w:p>
-          <w:p>
-            <w:pPr>
-              <w:spacing w:line="240" w:lineRule="auto"/>
-              <w:jc w:val="both"/>
-              <w:rPr>
-                <w:rFonts w:ascii="Calibri" w:hAnsi="Calibri" w:cs="Arial"/>
-                <w:b/>
-                <w:bCs/>
+              <w:t xml:space="preserve">- </w:t>
+            </w:r>
+            <w:r>
+              <w:rPr>
+                <w:rFonts w:ascii="Calibri" w:hAnsi="Calibri" w:cs="Arial"/>
                 <w:iCs/>
                 <w:lang w:eastAsia="es-CL"/>
               </w:rPr>
-            </w:pPr>
-            <w:r>
-              <w:rPr>
-                <w:rFonts w:ascii="Calibri" w:hAnsi="Calibri" w:cs="Arial"/>
-                <w:b/>
-                <w:bCs/>
+              <w:t xml:space="preserve">Diseñar una arquitectura de solución que integre cámara IP, Raspberry Pi, procesamiento de visión artificial, </w:t>
+            </w:r>
+            <w:proofErr w:type="spellStart"/>
+            <w:r>
+              <w:rPr>
+                <w:rFonts w:ascii="Calibri" w:hAnsi="Calibri" w:cs="Arial"/>
                 <w:iCs/>
                 <w:lang w:eastAsia="es-CL"/>
               </w:rPr>
-              <w:t>- Entrenar un modelo de Machine Learning para la detección de patentes vehiculares en imágenes capturadas por cámara.</w:t>
-            </w:r>
-          </w:p>
-          <w:p>
-            <w:pPr>
-              <w:spacing w:line="240" w:lineRule="auto"/>
-              <w:jc w:val="both"/>
-              <w:rPr>
-                <w:rFonts w:ascii="Calibri" w:hAnsi="Calibri" w:cs="Arial"/>
-                <w:b/>
-                <w:bCs/>
+              <w:t>backend</w:t>
+            </w:r>
+            <w:proofErr w:type="spellEnd"/>
+            <w:r>
+              <w:rPr>
+                <w:rFonts w:ascii="Calibri" w:hAnsi="Calibri" w:cs="Arial"/>
                 <w:iCs/>
                 <w:lang w:eastAsia="es-CL"/>
               </w:rPr>
-            </w:pPr>
-            <w:r>
-              <w:rPr>
-                <w:rFonts w:ascii="Calibri" w:hAnsi="Calibri" w:cs="Arial"/>
-                <w:b/>
-                <w:bCs/>
+              <w:t>, base de datos e interfaz web.</w:t>
+            </w:r>
+          </w:p>
+          <w:p>
+            <w:pPr>
+              <w:spacing w:line="240" w:lineRule="auto"/>
+              <w:jc w:val="both"/>
+              <w:rPr>
+                <w:rFonts w:ascii="Calibri" w:hAnsi="Calibri" w:cs="Arial"/>
                 <w:iCs/>
                 <w:lang w:eastAsia="es-CL"/>
               </w:rPr>
+            </w:pPr>
+            <w:r>
+              <w:rPr>
+                <w:rFonts w:ascii="Calibri" w:hAnsi="Calibri" w:cs="Arial"/>
+                <w:iCs/>
+                <w:lang w:eastAsia="es-CL"/>
+              </w:rPr>
+              <w:t xml:space="preserve">- </w:t>
+            </w:r>
+            <w:r>
+              <w:rPr>
+                <w:rFonts w:ascii="Calibri" w:hAnsi="Calibri" w:cs="Arial"/>
+                <w:iCs/>
+                <w:lang w:eastAsia="es-CL"/>
+              </w:rPr>
+              <w:t>Diseñar e implementar un modelo de datos para administrar recintos, usuarios, vehículos, visitas y registros de acceso.</w:t>
+            </w:r>
+          </w:p>
+          <w:p>
+            <w:pPr>
+              <w:spacing w:line="240" w:lineRule="auto"/>
+              <w:jc w:val="both"/>
+              <w:rPr>
+                <w:rFonts w:ascii="Calibri" w:hAnsi="Calibri" w:cs="Arial"/>
+                <w:iCs/>
+                <w:lang w:eastAsia="es-CL"/>
+              </w:rPr>
+            </w:pPr>
+            <w:r>
+              <w:rPr>
+                <w:rFonts w:ascii="Calibri" w:hAnsi="Calibri" w:cs="Arial"/>
+                <w:iCs/>
+                <w:lang w:eastAsia="es-CL"/>
+              </w:rPr>
+              <w:t xml:space="preserve">- </w:t>
+            </w:r>
+            <w:r>
+              <w:rPr>
+                <w:rFonts w:ascii="Calibri" w:hAnsi="Calibri" w:cs="Arial"/>
+                <w:iCs/>
+                <w:lang w:eastAsia="es-CL"/>
+              </w:rPr>
+              <w:t>Preparar el entorno de procesamiento en Raspberry Pi 4 y establecer la comunicación con la cámara Tapo C310 mediante los mecanismos de transmisión compatibles.</w:t>
+            </w:r>
+          </w:p>
+          <w:p>
+            <w:pPr>
+              <w:spacing w:line="240" w:lineRule="auto"/>
+              <w:jc w:val="both"/>
+              <w:rPr>
+                <w:rFonts w:ascii="Calibri" w:hAnsi="Calibri" w:cs="Arial"/>
+                <w:iCs/>
+                <w:lang w:eastAsia="es-CL"/>
+              </w:rPr>
+            </w:pPr>
+            <w:r>
+              <w:rPr>
+                <w:rFonts w:ascii="Calibri" w:hAnsi="Calibri" w:cs="Arial"/>
+                <w:iCs/>
+                <w:lang w:eastAsia="es-CL"/>
+              </w:rPr>
+              <w:t xml:space="preserve">- Entrenar un modelo de Machine </w:t>
+            </w:r>
+            <w:proofErr w:type="spellStart"/>
+            <w:r>
+              <w:rPr>
+                <w:rFonts w:ascii="Calibri" w:hAnsi="Calibri" w:cs="Arial"/>
+                <w:iCs/>
+                <w:lang w:eastAsia="es-CL"/>
+              </w:rPr>
+              <w:t>Learning</w:t>
+            </w:r>
+            <w:proofErr w:type="spellEnd"/>
+            <w:r>
+              <w:rPr>
+                <w:rFonts w:ascii="Calibri" w:hAnsi="Calibri" w:cs="Arial"/>
+                <w:iCs/>
+                <w:lang w:eastAsia="es-CL"/>
+              </w:rPr>
+              <w:t xml:space="preserve"> para la detección de patentes vehiculares en imágenes capturadas por cámara.</w:t>
+            </w:r>
+          </w:p>
+          <w:p>
+            <w:pPr>
+              <w:spacing w:line="240" w:lineRule="auto"/>
+              <w:jc w:val="both"/>
+              <w:rPr>
+                <w:rFonts w:ascii="Calibri" w:hAnsi="Calibri" w:cs="Arial"/>
+                <w:iCs/>
+                <w:lang w:eastAsia="es-CL"/>
+              </w:rPr>
+            </w:pPr>
+            <w:r>
+              <w:rPr>
+                <w:rFonts w:ascii="Calibri" w:hAnsi="Calibri" w:cs="Arial"/>
+                <w:iCs/>
+                <w:lang w:eastAsia="es-CL"/>
+              </w:rPr>
               <w:t>- Implementar un proceso de reconocimiento óptico de caracteres y validación de formato para la lectura de patentes.</w:t>
             </w:r>
           </w:p>
@@ -2814,8 +2728,6 @@
               <w:jc w:val="both"/>
               <w:rPr>
                 <w:rFonts w:ascii="Calibri" w:hAnsi="Calibri" w:cs="Arial"/>
-                <w:b/>
-                <w:bCs/>
                 <w:iCs/>
                 <w:lang w:eastAsia="es-CL"/>
               </w:rPr>
@@ -2823,8 +2735,6 @@
             <w:r>
               <w:rPr>
                 <w:rFonts w:ascii="Calibri" w:hAnsi="Calibri" w:cs="Arial"/>
-                <w:b/>
-                <w:bCs/>
                 <w:iCs/>
                 <w:lang w:eastAsia="es-CL"/>
               </w:rPr>
@@ -2837,8 +2747,6 @@
               <w:jc w:val="both"/>
               <w:rPr>
                 <w:rFonts w:ascii="Calibri" w:hAnsi="Calibri" w:cs="Arial"/>
-                <w:b/>
-                <w:bCs/>
                 <w:iCs/>
                 <w:lang w:eastAsia="es-CL"/>
               </w:rPr>
@@ -2846,31 +2754,33 @@
             <w:r>
               <w:rPr>
                 <w:rFonts w:ascii="Calibri" w:hAnsi="Calibri" w:cs="Arial"/>
-                <w:b/>
-                <w:bCs/>
                 <w:iCs/>
                 <w:lang w:eastAsia="es-CL"/>
               </w:rPr>
-              <w:t>- Integrar la cámara IP al sistema de procesamiento mediante protocolo RTSP/ONVIF.</w:t>
-            </w:r>
-          </w:p>
-          <w:p>
-            <w:pPr>
-              <w:spacing w:line="240" w:lineRule="auto"/>
-              <w:jc w:val="both"/>
-              <w:rPr>
-                <w:rFonts w:ascii="Calibri" w:hAnsi="Calibri" w:cs="Arial"/>
-                <w:b/>
-                <w:bCs/>
+              <w:t xml:space="preserve">- </w:t>
+            </w:r>
+            <w:r>
+              <w:rPr>
+                <w:rFonts w:ascii="Calibri" w:hAnsi="Calibri" w:cs="Arial"/>
                 <w:iCs/>
                 <w:lang w:eastAsia="es-CL"/>
               </w:rPr>
-            </w:pPr>
-            <w:r>
-              <w:rPr>
-                <w:rFonts w:ascii="Calibri" w:hAnsi="Calibri" w:cs="Arial"/>
-                <w:b/>
-                <w:bCs/>
+              <w:t>Implementar la gestión de vehículos autorizados y vehículos de visita con vigencia definida.</w:t>
+            </w:r>
+          </w:p>
+          <w:p>
+            <w:pPr>
+              <w:spacing w:line="240" w:lineRule="auto"/>
+              <w:jc w:val="both"/>
+              <w:rPr>
+                <w:rFonts w:ascii="Calibri" w:hAnsi="Calibri" w:cs="Arial"/>
+                <w:iCs/>
+                <w:lang w:eastAsia="es-CL"/>
+              </w:rPr>
+            </w:pPr>
+            <w:r>
+              <w:rPr>
+                <w:rFonts w:ascii="Calibri" w:hAnsi="Calibri" w:cs="Arial"/>
                 <w:iCs/>
                 <w:lang w:eastAsia="es-CL"/>
               </w:rPr>
@@ -2891,8 +2801,6 @@
             <w:r>
               <w:rPr>
                 <w:rFonts w:ascii="Calibri" w:hAnsi="Calibri" w:cs="Arial"/>
-                <w:b/>
-                <w:bCs/>
                 <w:iCs/>
                 <w:lang w:eastAsia="es-CL"/>
               </w:rPr>
@@ -3165,6 +3073,7 @@
                 <w:rFonts w:ascii="Calibri" w:hAnsi="Calibri"/>
                 <w:color w:val="1F3864" w:themeColor="accent1" w:themeShade="80"/>
               </w:rPr>
+              <w:lastRenderedPageBreak/>
               <w:t xml:space="preserve">Descripción </w:t>
             </w:r>
             <w:r>
@@ -3198,6 +3107,377 @@
               <w:jc w:val="both"/>
               <w:rPr>
                 <w:rFonts w:ascii="Calibri" w:hAnsi="Calibri" w:cs="Arial"/>
+                <w:iCs/>
+                <w:lang w:eastAsia="es-CL"/>
+              </w:rPr>
+            </w:pPr>
+            <w:r>
+              <w:rPr>
+                <w:rFonts w:ascii="Calibri" w:hAnsi="Calibri" w:cs="Arial"/>
+                <w:iCs/>
+                <w:lang w:eastAsia="es-CL"/>
+              </w:rPr>
+              <w:t>El desarrollo del Proyecto APT se abordará bajo el marco de trabajo ágil Scrum, organizado en sprints de dos semanas que permiten avanzar de forma incremental, con entregas parciales verificables al cierre de cada ciclo. Se optó por esta metodología en lugar de un enfoque en cascada, ya que gran parte de las tareas del proyecto pueden desarrollarse en paralelo por ambos integrantes, sin que exista una dependencia estricta entre ellas hasta la etapa final de integración.</w:t>
+            </w:r>
+          </w:p>
+          <w:p>
+            <w:pPr>
+              <w:spacing w:line="240" w:lineRule="auto"/>
+              <w:jc w:val="both"/>
+              <w:rPr>
+                <w:rFonts w:ascii="Calibri" w:hAnsi="Calibri" w:cs="Arial"/>
+                <w:iCs/>
+                <w:lang w:eastAsia="es-CL"/>
+              </w:rPr>
+            </w:pPr>
+            <w:r>
+              <w:rPr>
+                <w:rFonts w:ascii="Calibri" w:hAnsi="Calibri" w:cs="Arial"/>
+                <w:iCs/>
+                <w:lang w:eastAsia="es-CL"/>
+              </w:rPr>
+              <w:t>Concretamente, mientras Erick trabaja en el entrenamiento y ajuste del modelo de Machine Learning para el reconocimiento de patentes, Brandon desarrolla en paralelo la aplicación web, incluyendo las vistas diferenciadas por rol (Administrador, Propietario, Guardia) y el sistema de alertas. Este desarrollo paralelo es posible porque el modelo de datos del sistema ya se encuentra definido, lo que permite construir la aplicación web sobre esa estructura sin necesidad de esperar a que el modelo de Machine Learning esté completamente entrenado.</w:t>
+            </w:r>
+          </w:p>
+          <w:p>
+            <w:pPr>
+              <w:spacing w:line="240" w:lineRule="auto"/>
+              <w:jc w:val="both"/>
+              <w:rPr>
+                <w:rFonts w:ascii="Calibri" w:hAnsi="Calibri" w:cs="Arial"/>
+                <w:iCs/>
+                <w:lang w:eastAsia="es-CL"/>
+              </w:rPr>
+            </w:pPr>
+            <w:r>
+              <w:rPr>
+                <w:rFonts w:ascii="Calibri" w:hAnsi="Calibri" w:cs="Arial"/>
+                <w:iCs/>
+                <w:lang w:eastAsia="es-CL"/>
+              </w:rPr>
+              <w:t>Las etapas de trabajo se organizan de la siguiente forma:</w:t>
+            </w:r>
+          </w:p>
+          <w:p>
+            <w:pPr>
+              <w:spacing w:line="240" w:lineRule="auto"/>
+              <w:jc w:val="both"/>
+              <w:rPr>
+                <w:rFonts w:ascii="Calibri" w:hAnsi="Calibri" w:cs="Arial"/>
+                <w:iCs/>
+                <w:lang w:eastAsia="es-CL"/>
+              </w:rPr>
+            </w:pPr>
+            <w:r>
+              <w:rPr>
+                <w:rFonts w:ascii="Calibri" w:hAnsi="Calibri" w:cs="Arial"/>
+                <w:iCs/>
+                <w:lang w:eastAsia="es-CL"/>
+              </w:rPr>
+              <w:t>Sprint 0 — Preparación: recolección del dataset y configuración del entorno de entrenamiento (Erick); creación del modelo de datos y estructura base del proyecto web (Brandon).</w:t>
+            </w:r>
+          </w:p>
+          <w:p>
+            <w:pPr>
+              <w:spacing w:line="240" w:lineRule="auto"/>
+              <w:jc w:val="both"/>
+              <w:rPr>
+                <w:rFonts w:ascii="Calibri" w:hAnsi="Calibri" w:cs="Arial"/>
+                <w:iCs/>
+                <w:lang w:eastAsia="es-CL"/>
+              </w:rPr>
+            </w:pPr>
+            <w:r>
+              <w:rPr>
+                <w:rFonts w:ascii="Calibri" w:hAnsi="Calibri" w:cs="Arial"/>
+                <w:iCs/>
+                <w:lang w:eastAsia="es-CL"/>
+              </w:rPr>
+              <w:t>Sprint 1: primer entrenamiento (fine-</w:t>
+            </w:r>
+            <w:proofErr w:type="spellStart"/>
+            <w:r>
+              <w:rPr>
+                <w:rFonts w:ascii="Calibri" w:hAnsi="Calibri" w:cs="Arial"/>
+                <w:iCs/>
+                <w:lang w:eastAsia="es-CL"/>
+              </w:rPr>
+              <w:t>tuning</w:t>
+            </w:r>
+            <w:proofErr w:type="spellEnd"/>
+            <w:r>
+              <w:rPr>
+                <w:rFonts w:ascii="Calibri" w:hAnsi="Calibri" w:cs="Arial"/>
+                <w:iCs/>
+                <w:lang w:eastAsia="es-CL"/>
+              </w:rPr>
+              <w:t>) del modelo YOLO para detección de patentes (Erick); sistema de autenticación y vistas base por rol (Brandon).</w:t>
+            </w:r>
+          </w:p>
+          <w:p>
+            <w:pPr>
+              <w:spacing w:line="240" w:lineRule="auto"/>
+              <w:jc w:val="both"/>
+              <w:rPr>
+                <w:rFonts w:ascii="Calibri" w:hAnsi="Calibri" w:cs="Arial"/>
+                <w:iCs/>
+                <w:lang w:eastAsia="es-CL"/>
+              </w:rPr>
+            </w:pPr>
+            <w:r>
+              <w:rPr>
+                <w:rFonts w:ascii="Calibri" w:hAnsi="Calibri" w:cs="Arial"/>
+                <w:iCs/>
+                <w:lang w:eastAsia="es-CL"/>
+              </w:rPr>
+              <w:t>Sprint 2: integración de OCR y validación de formato de patente (Erick); gestión de vehículos autorizados y de visita (Brandon).</w:t>
+            </w:r>
+          </w:p>
+          <w:p>
+            <w:pPr>
+              <w:spacing w:line="240" w:lineRule="auto"/>
+              <w:jc w:val="both"/>
+              <w:rPr>
+                <w:rFonts w:ascii="Calibri" w:hAnsi="Calibri" w:cs="Arial"/>
+                <w:iCs/>
+                <w:lang w:eastAsia="es-CL"/>
+              </w:rPr>
+            </w:pPr>
+            <w:r>
+              <w:rPr>
+                <w:rFonts w:ascii="Calibri" w:hAnsi="Calibri" w:cs="Arial"/>
+                <w:iCs/>
+                <w:lang w:eastAsia="es-CL"/>
+              </w:rPr>
+              <w:t xml:space="preserve">Sprint 3: </w:t>
+            </w:r>
+            <w:r>
+              <w:rPr>
+                <w:rFonts w:ascii="Calibri" w:hAnsi="Calibri" w:cs="Arial"/>
+                <w:iCs/>
+                <w:lang w:eastAsia="es-CL"/>
+              </w:rPr>
+              <w:t>Configuración</w:t>
+            </w:r>
+            <w:r>
+              <w:rPr>
+                <w:rFonts w:ascii="Calibri" w:hAnsi="Calibri" w:cs="Arial"/>
+                <w:iCs/>
+                <w:lang w:eastAsia="es-CL"/>
+              </w:rPr>
+              <w:t xml:space="preserve"> </w:t>
+            </w:r>
+            <w:r>
+              <w:rPr>
+                <w:rFonts w:ascii="Calibri" w:hAnsi="Calibri" w:cs="Arial"/>
+                <w:iCs/>
+                <w:lang w:eastAsia="es-CL"/>
+              </w:rPr>
+              <w:t>de la Raspberry Pi</w:t>
+            </w:r>
+            <w:r>
+              <w:rPr>
+                <w:rFonts w:ascii="Calibri" w:hAnsi="Calibri" w:cs="Arial"/>
+                <w:iCs/>
+                <w:lang w:eastAsia="es-CL"/>
+              </w:rPr>
+              <w:t xml:space="preserve"> y </w:t>
+            </w:r>
+            <w:r>
+              <w:rPr>
+                <w:rFonts w:ascii="Calibri" w:hAnsi="Calibri" w:cs="Arial"/>
+                <w:iCs/>
+                <w:lang w:eastAsia="es-CL"/>
+              </w:rPr>
+              <w:t>conexión de la Tapo C310</w:t>
+            </w:r>
+            <w:r>
+              <w:rPr>
+                <w:rFonts w:ascii="Calibri" w:hAnsi="Calibri" w:cs="Arial"/>
+                <w:iCs/>
+                <w:lang w:eastAsia="es-CL"/>
+              </w:rPr>
+              <w:t xml:space="preserve"> </w:t>
+            </w:r>
+            <w:r>
+              <w:rPr>
+                <w:rFonts w:ascii="Calibri" w:hAnsi="Calibri" w:cs="Arial"/>
+                <w:iCs/>
+                <w:lang w:eastAsia="es-CL"/>
+              </w:rPr>
+              <w:t>ONVIF (Erick); sistema de alertas en tiempo real (Brandon).</w:t>
+            </w:r>
+          </w:p>
+          <w:p>
+            <w:pPr>
+              <w:spacing w:line="240" w:lineRule="auto"/>
+              <w:jc w:val="both"/>
+              <w:rPr>
+                <w:rFonts w:ascii="Calibri" w:hAnsi="Calibri" w:cs="Arial"/>
+                <w:iCs/>
+                <w:lang w:eastAsia="es-CL"/>
+              </w:rPr>
+            </w:pPr>
+            <w:r>
+              <w:rPr>
+                <w:rFonts w:ascii="Calibri" w:hAnsi="Calibri" w:cs="Arial"/>
+                <w:iCs/>
+                <w:lang w:eastAsia="es-CL"/>
+              </w:rPr>
+              <w:t xml:space="preserve">Sprint 4 — Integración: conexión conjunta del pipeline de reconocimiento con el </w:t>
+            </w:r>
+            <w:proofErr w:type="spellStart"/>
+            <w:r>
+              <w:rPr>
+                <w:rFonts w:ascii="Calibri" w:hAnsi="Calibri" w:cs="Arial"/>
+                <w:iCs/>
+                <w:lang w:eastAsia="es-CL"/>
+              </w:rPr>
+              <w:t>backend</w:t>
+            </w:r>
+            <w:proofErr w:type="spellEnd"/>
+            <w:r>
+              <w:rPr>
+                <w:rFonts w:ascii="Calibri" w:hAnsi="Calibri" w:cs="Arial"/>
+                <w:iCs/>
+                <w:lang w:eastAsia="es-CL"/>
+              </w:rPr>
+              <w:t xml:space="preserve"> web, validando el resultado contra la base de datos y disparando alertas cuando corresponda.</w:t>
+            </w:r>
+          </w:p>
+          <w:p>
+            <w:pPr>
+              <w:spacing w:line="240" w:lineRule="auto"/>
+              <w:jc w:val="both"/>
+              <w:rPr>
+                <w:rFonts w:ascii="Calibri" w:hAnsi="Calibri" w:cs="Arial"/>
+                <w:iCs/>
+                <w:lang w:eastAsia="es-CL"/>
+              </w:rPr>
+            </w:pPr>
+            <w:r>
+              <w:rPr>
+                <w:rFonts w:ascii="Calibri" w:hAnsi="Calibri" w:cs="Arial"/>
+                <w:iCs/>
+                <w:lang w:eastAsia="es-CL"/>
+              </w:rPr>
+              <w:t>Sprint 5 — Cierre: pruebas en terreno con vehículos autorizados para calibración, corrección de errores y documentación final del proyecto.</w:t>
+            </w:r>
+          </w:p>
+          <w:p>
+            <w:pPr>
+              <w:spacing w:line="240" w:lineRule="auto"/>
+              <w:jc w:val="both"/>
+              <w:rPr>
+                <w:rFonts w:ascii="Calibri" w:hAnsi="Calibri" w:cs="Arial"/>
+                <w:iCs/>
+                <w:lang w:eastAsia="es-CL"/>
+              </w:rPr>
+            </w:pPr>
+            <w:r>
+              <w:rPr>
+                <w:rFonts w:ascii="Calibri" w:hAnsi="Calibri" w:cs="Arial"/>
+                <w:iCs/>
+                <w:lang w:eastAsia="es-CL"/>
+              </w:rPr>
+              <w:t>El diseño de las pruebas de validación considera criterios concretos de éxito: tasa de acierto en la detección de patentes por parte del modelo YOLO, precisión del texto extraído por el OCR frente al valor real de la patente, y tiempo de respuesta del pipeline completo desde la captura hasta la validación. Estas pruebas se aplican sobre los vehículos autorizados para la calibración del sistema, comparando el resultado obtenido contra el resultado esperado en cada caso.</w:t>
+            </w:r>
+          </w:p>
+          <w:p>
+            <w:pPr>
+              <w:spacing w:line="240" w:lineRule="auto"/>
+              <w:jc w:val="both"/>
+              <w:rPr>
+                <w:rFonts w:ascii="Calibri" w:hAnsi="Calibri" w:cs="Arial"/>
+                <w:iCs/>
+                <w:lang w:eastAsia="es-CL"/>
+              </w:rPr>
+            </w:pPr>
+            <w:r>
+              <w:rPr>
+                <w:rFonts w:ascii="Calibri" w:hAnsi="Calibri" w:cs="Arial"/>
+                <w:iCs/>
+                <w:lang w:eastAsia="es-CL"/>
+              </w:rPr>
+              <w:t>El control del avance del proyecto se realiza mediante revisiones semanales entre ambos integrantes, comparando el trabajo realizado contra lo planificado en la Carta Gantt para cada sprint. Este seguimiento permite detectar oportunamente desviaciones respecto a la planificación y tomar decisiones de ajuste, como redistribuir tareas o modificar el alcance de un sprint en caso de que sea necesario.</w:t>
+            </w:r>
+          </w:p>
+          <w:p>
+            <w:pPr>
+              <w:spacing w:line="240" w:lineRule="auto"/>
+              <w:jc w:val="both"/>
+              <w:rPr>
+                <w:rFonts w:ascii="Calibri" w:hAnsi="Calibri" w:cs="Arial"/>
+                <w:iCs/>
+                <w:lang w:eastAsia="es-CL"/>
+              </w:rPr>
+            </w:pPr>
+            <w:r>
+              <w:rPr>
+                <w:rFonts w:ascii="Calibri" w:hAnsi="Calibri" w:cs="Arial"/>
+                <w:iCs/>
+                <w:lang w:eastAsia="es-CL"/>
+              </w:rPr>
+              <w:t>Funciones y responsabilidades por integrante:</w:t>
+            </w:r>
+          </w:p>
+          <w:p>
+            <w:pPr>
+              <w:spacing w:line="240" w:lineRule="auto"/>
+              <w:jc w:val="both"/>
+              <w:rPr>
+                <w:rFonts w:ascii="Calibri" w:hAnsi="Calibri" w:cs="Arial"/>
+                <w:iCs/>
+                <w:lang w:eastAsia="es-CL"/>
+              </w:rPr>
+            </w:pPr>
+            <w:r>
+              <w:rPr>
+                <w:rFonts w:ascii="Calibri" w:hAnsi="Calibri" w:cs="Arial"/>
+                <w:iCs/>
+                <w:lang w:eastAsia="es-CL"/>
+              </w:rPr>
+              <w:t>Erick: diseño del modelo de datos, entrenamiento y ajuste del modelo de Machine Learning, e integración de la cámara IP</w:t>
+            </w:r>
+            <w:r>
+              <w:rPr>
+                <w:rFonts w:ascii="Calibri" w:hAnsi="Calibri" w:cs="Arial"/>
+                <w:iCs/>
+                <w:lang w:eastAsia="es-CL"/>
+              </w:rPr>
+              <w:t xml:space="preserve"> + </w:t>
+            </w:r>
+            <w:r>
+              <w:rPr>
+                <w:rFonts w:ascii="Calibri" w:hAnsi="Calibri" w:cs="Arial"/>
+                <w:iCs/>
+                <w:lang w:eastAsia="es-CL"/>
+              </w:rPr>
+              <w:t>Rasp</w:t>
+            </w:r>
+            <w:r>
+              <w:rPr>
+                <w:rFonts w:ascii="Calibri" w:hAnsi="Calibri" w:cs="Arial"/>
+                <w:iCs/>
+                <w:lang w:eastAsia="es-CL"/>
+              </w:rPr>
+              <w:t>berry PI</w:t>
+            </w:r>
+            <w:r>
+              <w:rPr>
+                <w:rFonts w:ascii="Calibri" w:hAnsi="Calibri" w:cs="Arial"/>
+                <w:iCs/>
+                <w:lang w:eastAsia="es-CL"/>
+              </w:rPr>
+              <w:t>.</w:t>
+            </w:r>
+          </w:p>
+          <w:p>
+            <w:pPr>
+              <w:spacing w:line="240" w:lineRule="auto"/>
+              <w:jc w:val="both"/>
+              <w:rPr>
+                <w:rFonts w:ascii="Calibri" w:hAnsi="Calibri" w:cs="Arial"/>
                 <w:b/>
                 <w:bCs/>
                 <w:iCs/>
@@ -3207,355 +3487,871 @@
             <w:r>
               <w:rPr>
                 <w:rFonts w:ascii="Calibri" w:hAnsi="Calibri" w:cs="Arial"/>
-                <w:b/>
-                <w:bCs/>
                 <w:iCs/>
                 <w:lang w:eastAsia="es-CL"/>
               </w:rPr>
-              <w:t>El desarrollo del Proyecto APT se abordará bajo el marco de trabajo ágil Scrum, organizado en sprints de dos semanas que permiten avanzar de forma incremental, con entregas parciales verificables al cierre de cada ciclo. Se optó por esta metodología en lugar de un enfoque en cascada, ya que gran parte de las tareas del proyecto pueden desarrollarse en paralelo por ambos integrantes, sin que exista una dependencia estricta entre ellas hasta la etapa final de integración.</w:t>
-            </w:r>
-          </w:p>
-          <w:p>
-            <w:pPr>
-              <w:spacing w:line="240" w:lineRule="auto"/>
-              <w:jc w:val="both"/>
-              <w:rPr>
-                <w:rFonts w:ascii="Calibri" w:hAnsi="Calibri" w:cs="Arial"/>
-                <w:b/>
-                <w:bCs/>
-                <w:iCs/>
-                <w:lang w:eastAsia="es-CL"/>
-              </w:rPr>
-            </w:pPr>
-            <w:r>
-              <w:rPr>
-                <w:rFonts w:ascii="Calibri" w:hAnsi="Calibri" w:cs="Arial"/>
-                <w:b/>
-                <w:bCs/>
-                <w:iCs/>
-                <w:lang w:eastAsia="es-CL"/>
-              </w:rPr>
-              <w:t>Concretamente, mientras Erick trabaja en el entrenamiento y ajuste del modelo de Machine Learning para el reconocimiento de patentes, Brandon desarrolla en paralelo la aplicación web, incluyendo las vistas diferenciadas por rol (Administrador, Propietario, Guardia) y el sistema de alertas. Este desarrollo paralelo es posible porque el modelo de datos del sistema ya se encuentra definido, lo que permite construir la aplicación web sobre esa estructura sin necesidad de esperar a que el modelo de Machine Learning esté completamente entrenado.</w:t>
-            </w:r>
-          </w:p>
-          <w:p>
-            <w:pPr>
-              <w:spacing w:line="240" w:lineRule="auto"/>
-              <w:jc w:val="both"/>
-              <w:rPr>
-                <w:rFonts w:ascii="Calibri" w:hAnsi="Calibri" w:cs="Arial"/>
-                <w:b/>
-                <w:bCs/>
-                <w:iCs/>
-                <w:lang w:eastAsia="es-CL"/>
-              </w:rPr>
-            </w:pPr>
-            <w:r>
-              <w:rPr>
-                <w:rFonts w:ascii="Calibri" w:hAnsi="Calibri" w:cs="Arial"/>
-                <w:b/>
-                <w:bCs/>
-                <w:iCs/>
-                <w:lang w:eastAsia="es-CL"/>
-              </w:rPr>
-              <w:t>Las etapas de trabajo se organizan de la siguiente forma:</w:t>
-            </w:r>
-          </w:p>
-          <w:p>
-            <w:pPr>
-              <w:spacing w:line="240" w:lineRule="auto"/>
-              <w:jc w:val="both"/>
-              <w:rPr>
-                <w:rFonts w:ascii="Calibri" w:hAnsi="Calibri" w:cs="Arial"/>
-                <w:b/>
-                <w:bCs/>
-                <w:iCs/>
-                <w:lang w:eastAsia="es-CL"/>
-              </w:rPr>
-            </w:pPr>
-            <w:r>
-              <w:rPr>
-                <w:rFonts w:ascii="Calibri" w:hAnsi="Calibri" w:cs="Arial"/>
-                <w:b/>
-                <w:bCs/>
-                <w:iCs/>
-                <w:lang w:eastAsia="es-CL"/>
-              </w:rPr>
-              <w:t>Sprint 0 — Preparación: recolección del dataset y configuración del entorno de entrenamiento (Erick); creación del modelo de datos y estructura base del proyecto web (Brandon).</w:t>
-            </w:r>
-          </w:p>
-          <w:p>
-            <w:pPr>
-              <w:spacing w:line="240" w:lineRule="auto"/>
-              <w:jc w:val="both"/>
-              <w:rPr>
-                <w:rFonts w:ascii="Calibri" w:hAnsi="Calibri" w:cs="Arial"/>
-                <w:b/>
-                <w:bCs/>
-                <w:iCs/>
-                <w:lang w:eastAsia="es-CL"/>
-              </w:rPr>
-            </w:pPr>
-            <w:r>
-              <w:rPr>
-                <w:rFonts w:ascii="Calibri" w:hAnsi="Calibri" w:cs="Arial"/>
-                <w:b/>
-                <w:bCs/>
-                <w:iCs/>
-                <w:lang w:eastAsia="es-CL"/>
-              </w:rPr>
-              <w:t>Sprint 1: primer entrenamiento (fine-</w:t>
+              <w:t>Brandon: desarrollo de la aplicación web (vistas y perfiles por rol), implementación del sistema de alertas en tiempo real, y documentación del proyecto.</w:t>
+            </w:r>
+          </w:p>
+        </w:tc>
+      </w:tr>
+    </w:tbl>
+    <w:p>
+      <w:pPr>
+        <w:spacing w:after="0" w:line="240" w:lineRule="auto"/>
+        <w:jc w:val="both"/>
+        <w:rPr>
+          <w:b/>
+          <w:sz w:val="24"/>
+          <w:szCs w:val="24"/>
+        </w:rPr>
+      </w:pPr>
+    </w:p>
+    <w:tbl>
+      <w:tblPr>
+        <w:tblStyle w:val="Tablaconcuadrcula"/>
+        <w:tblW w:w="9640" w:type="dxa"/>
+        <w:tblInd w:w="-714" w:type="dxa"/>
+        <w:tblBorders>
+          <w:top w:val="single" w:sz="4" w:space="0" w:color="BFBFBF" w:themeColor="background1" w:themeShade="BF"/>
+          <w:left w:val="single" w:sz="4" w:space="0" w:color="BFBFBF" w:themeColor="background1" w:themeShade="BF"/>
+          <w:bottom w:val="single" w:sz="4" w:space="0" w:color="BFBFBF" w:themeColor="background1" w:themeShade="BF"/>
+          <w:right w:val="single" w:sz="4" w:space="0" w:color="BFBFBF" w:themeColor="background1" w:themeShade="BF"/>
+          <w:insideH w:val="single" w:sz="4" w:space="0" w:color="BFBFBF" w:themeColor="background1" w:themeShade="BF"/>
+          <w:insideV w:val="single" w:sz="4" w:space="0" w:color="BFBFBF" w:themeColor="background1" w:themeShade="BF"/>
+        </w:tblBorders>
+        <w:tblLook w:val="04A0" w:firstRow="1" w:lastRow="0" w:firstColumn="1" w:lastColumn="0" w:noHBand="0" w:noVBand="1"/>
+      </w:tblPr>
+      <w:tblGrid>
+        <w:gridCol w:w="9640"/>
+      </w:tblGrid>
+      <w:tr>
+        <w:trPr>
+          <w:trHeight w:val="440"/>
+        </w:trPr>
+        <w:tc>
+          <w:tcPr>
+            <w:tcW w:w="9640" w:type="dxa"/>
+            <w:vAlign w:val="center"/>
+          </w:tcPr>
+          <w:p>
+            <w:pPr>
+              <w:spacing w:line="240" w:lineRule="auto"/>
+              <w:jc w:val="both"/>
+              <w:rPr>
+                <w:b/>
+                <w:color w:val="1F3864" w:themeColor="accent1" w:themeShade="80"/>
+                <w:sz w:val="28"/>
+                <w:szCs w:val="28"/>
+              </w:rPr>
+            </w:pPr>
+            <w:r>
+              <w:rPr>
+                <w:b/>
+                <w:color w:val="1F3864" w:themeColor="accent1" w:themeShade="80"/>
+                <w:sz w:val="28"/>
+                <w:szCs w:val="28"/>
+              </w:rPr>
+              <w:lastRenderedPageBreak/>
+              <w:t>6</w:t>
+            </w:r>
+            <w:r>
+              <w:rPr>
+                <w:b/>
+                <w:color w:val="1F3864" w:themeColor="accent1" w:themeShade="80"/>
+                <w:sz w:val="28"/>
+                <w:szCs w:val="28"/>
+              </w:rPr>
+              <w:t xml:space="preserve">. </w:t>
+            </w:r>
+            <w:r>
+              <w:rPr>
+                <w:b/>
+                <w:color w:val="1F3864" w:themeColor="accent1" w:themeShade="80"/>
+                <w:sz w:val="28"/>
+                <w:szCs w:val="28"/>
+              </w:rPr>
+              <w:t>Evidencias</w:t>
+            </w:r>
+          </w:p>
+        </w:tc>
+      </w:tr>
+      <w:tr>
+        <w:trPr>
+          <w:trHeight w:val="440"/>
+        </w:trPr>
+        <w:tc>
+          <w:tcPr>
+            <w:tcW w:w="9640" w:type="dxa"/>
+            <w:shd w:val="clear" w:color="auto" w:fill="D9E2F3" w:themeFill="accent1" w:themeFillTint="33"/>
+            <w:vAlign w:val="center"/>
+          </w:tcPr>
+          <w:p>
+            <w:pPr>
+              <w:spacing w:after="0" w:line="240" w:lineRule="auto"/>
+              <w:jc w:val="both"/>
+              <w:rPr>
+                <w:rFonts w:eastAsia="Times New Roman" w:cs="Times New Roman"/>
+                <w:color w:val="595959" w:themeColor="text1" w:themeTint="A6"/>
+                <w:lang w:eastAsia="es-CL"/>
+              </w:rPr>
+            </w:pPr>
+            <w:r>
+              <w:rPr>
+                <w:rFonts w:ascii="Calibri" w:hAnsi="Calibri"/>
+                <w:color w:val="1F3864" w:themeColor="accent1" w:themeShade="80"/>
+              </w:rPr>
+              <w:t>A continuación, d</w:t>
+            </w:r>
+            <w:r>
+              <w:rPr>
+                <w:rFonts w:ascii="Calibri" w:hAnsi="Calibri"/>
+                <w:color w:val="1F3864" w:themeColor="accent1" w:themeShade="80"/>
+              </w:rPr>
+              <w:t xml:space="preserve">escribe qué evidencias serán evaluadas en el informe de avance y en el informe final de tu proyecto APT. Estas evidencias deben ser acordadas con tu docente. </w:t>
+            </w:r>
+            <w:r>
+              <w:t xml:space="preserve"> Se entenderá por evidencia los productos que se desarrollen durante el proyecto y cuyo propósito sea </w:t>
+            </w:r>
+            <w:r>
+              <w:t xml:space="preserve">visibilizar o </w:t>
+            </w:r>
+            <w:r>
+              <w:t xml:space="preserve">documentar cómo se ha implementado el trabajo. </w:t>
+            </w:r>
+            <w:r>
+              <w:rPr>
+                <w:rFonts w:eastAsia="Times New Roman" w:cs="Times New Roman"/>
+                <w:color w:val="595959" w:themeColor="text1" w:themeTint="A6"/>
+                <w:lang w:eastAsia="es-CL"/>
+              </w:rPr>
+              <w:t xml:space="preserve"> </w:t>
+            </w:r>
+          </w:p>
+        </w:tc>
+      </w:tr>
+    </w:tbl>
+    <w:p>
+      <w:pPr>
+        <w:spacing w:after="0" w:line="240" w:lineRule="auto"/>
+        <w:jc w:val="both"/>
+        <w:rPr>
+          <w:b/>
+          <w:sz w:val="24"/>
+          <w:szCs w:val="24"/>
+        </w:rPr>
+      </w:pPr>
+    </w:p>
+    <w:tbl>
+      <w:tblPr>
+        <w:tblStyle w:val="Tablaconcuadrcula"/>
+        <w:tblW w:w="10215" w:type="dxa"/>
+        <w:tblInd w:w="-714" w:type="dxa"/>
+        <w:tblBorders>
+          <w:top w:val="single" w:sz="4" w:space="0" w:color="BFBFBF" w:themeColor="background1" w:themeShade="BF"/>
+          <w:left w:val="single" w:sz="4" w:space="0" w:color="BFBFBF" w:themeColor="background1" w:themeShade="BF"/>
+          <w:bottom w:val="single" w:sz="4" w:space="0" w:color="BFBFBF" w:themeColor="background1" w:themeShade="BF"/>
+          <w:right w:val="single" w:sz="4" w:space="0" w:color="BFBFBF" w:themeColor="background1" w:themeShade="BF"/>
+          <w:insideH w:val="single" w:sz="4" w:space="0" w:color="BFBFBF" w:themeColor="background1" w:themeShade="BF"/>
+          <w:insideV w:val="single" w:sz="4" w:space="0" w:color="BFBFBF" w:themeColor="background1" w:themeShade="BF"/>
+        </w:tblBorders>
+        <w:tblLook w:val="04A0" w:firstRow="1" w:lastRow="0" w:firstColumn="1" w:lastColumn="0" w:noHBand="0" w:noVBand="1"/>
+      </w:tblPr>
+      <w:tblGrid>
+        <w:gridCol w:w="1995"/>
+        <w:gridCol w:w="1434"/>
+        <w:gridCol w:w="3801"/>
+        <w:gridCol w:w="2985"/>
+      </w:tblGrid>
+      <w:tr>
+        <w:trPr>
+          <w:trHeight w:val="362"/>
+        </w:trPr>
+        <w:tc>
+          <w:tcPr>
+            <w:tcW w:w="1995" w:type="dxa"/>
+            <w:vAlign w:val="center"/>
+          </w:tcPr>
+          <w:p>
+            <w:pPr>
+              <w:pStyle w:val="Piedepgina"/>
+              <w:jc w:val="both"/>
+              <w:rPr>
+                <w:rFonts w:ascii="Calibri" w:hAnsi="Calibri"/>
+                <w:b/>
+                <w:color w:val="1F3864" w:themeColor="accent1" w:themeShade="80"/>
+              </w:rPr>
+            </w:pPr>
+            <w:r>
+              <w:rPr>
+                <w:rFonts w:ascii="Calibri" w:hAnsi="Calibri"/>
+                <w:b/>
+                <w:color w:val="1F3864" w:themeColor="accent1" w:themeShade="80"/>
+              </w:rPr>
+              <w:t xml:space="preserve">Tipo de evidencia </w:t>
+            </w:r>
+          </w:p>
+          <w:p>
+            <w:pPr>
+              <w:pStyle w:val="Piedepgina"/>
+              <w:jc w:val="both"/>
+              <w:rPr>
+                <w:rFonts w:ascii="Calibri" w:hAnsi="Calibri"/>
+                <w:b/>
+                <w:color w:val="1F3864" w:themeColor="accent1" w:themeShade="80"/>
+              </w:rPr>
+            </w:pPr>
+            <w:r>
+              <w:rPr>
+                <w:rFonts w:ascii="Calibri" w:hAnsi="Calibri"/>
+                <w:b/>
+                <w:color w:val="1F3864" w:themeColor="accent1" w:themeShade="80"/>
+              </w:rPr>
+              <w:t>(avance o final)</w:t>
+            </w:r>
+          </w:p>
+        </w:tc>
+        <w:tc>
+          <w:tcPr>
+            <w:tcW w:w="1434" w:type="dxa"/>
+            <w:vAlign w:val="center"/>
+          </w:tcPr>
+          <w:p>
+            <w:pPr>
+              <w:pStyle w:val="Piedepgina"/>
+              <w:jc w:val="both"/>
+              <w:rPr>
+                <w:rFonts w:ascii="Calibri" w:hAnsi="Calibri"/>
+                <w:b/>
+                <w:color w:val="1F3864" w:themeColor="accent1" w:themeShade="80"/>
+              </w:rPr>
+            </w:pPr>
+            <w:r>
+              <w:rPr>
+                <w:rFonts w:ascii="Calibri" w:hAnsi="Calibri"/>
+                <w:b/>
+                <w:color w:val="1F3864" w:themeColor="accent1" w:themeShade="80"/>
+              </w:rPr>
+              <w:t>Nombre de la evidencia</w:t>
+            </w:r>
+          </w:p>
+        </w:tc>
+        <w:tc>
+          <w:tcPr>
+            <w:tcW w:w="3801" w:type="dxa"/>
+            <w:vAlign w:val="center"/>
+          </w:tcPr>
+          <w:p>
+            <w:pPr>
+              <w:pStyle w:val="Piedepgina"/>
+              <w:jc w:val="both"/>
+              <w:rPr>
+                <w:rFonts w:ascii="Calibri" w:hAnsi="Calibri"/>
+                <w:b/>
+                <w:color w:val="1F3864" w:themeColor="accent1" w:themeShade="80"/>
+              </w:rPr>
+            </w:pPr>
+            <w:r>
+              <w:rPr>
+                <w:rFonts w:ascii="Calibri" w:hAnsi="Calibri"/>
+                <w:b/>
+                <w:color w:val="1F3864" w:themeColor="accent1" w:themeShade="80"/>
+              </w:rPr>
+              <w:t>Descripción</w:t>
+            </w:r>
+          </w:p>
+        </w:tc>
+        <w:tc>
+          <w:tcPr>
+            <w:tcW w:w="2985" w:type="dxa"/>
+            <w:vAlign w:val="center"/>
+          </w:tcPr>
+          <w:p>
+            <w:pPr>
+              <w:pStyle w:val="Piedepgina"/>
+              <w:jc w:val="both"/>
+              <w:rPr>
+                <w:rFonts w:ascii="Calibri" w:hAnsi="Calibri"/>
+                <w:b/>
+                <w:color w:val="1F3864" w:themeColor="accent1" w:themeShade="80"/>
+              </w:rPr>
+            </w:pPr>
+            <w:r>
+              <w:rPr>
+                <w:rFonts w:ascii="Calibri" w:hAnsi="Calibri"/>
+                <w:b/>
+                <w:color w:val="1F3864" w:themeColor="accent1" w:themeShade="80"/>
+              </w:rPr>
+              <w:t>Justificación</w:t>
+            </w:r>
+          </w:p>
+        </w:tc>
+      </w:tr>
+      <w:tr>
+        <w:trPr>
+          <w:trHeight w:val="362"/>
+        </w:trPr>
+        <w:tc>
+          <w:tcPr>
+            <w:tcW w:w="1995" w:type="dxa"/>
+          </w:tcPr>
+          <w:p>
+            <w:pPr>
+              <w:pStyle w:val="Piedepgina"/>
+              <w:jc w:val="both"/>
+              <w:rPr>
+                <w:rFonts w:ascii="Calibri" w:hAnsi="Calibri"/>
+              </w:rPr>
+            </w:pPr>
+            <w:r>
+              <w:t>Avance</w:t>
+            </w:r>
+          </w:p>
+        </w:tc>
+        <w:tc>
+          <w:tcPr>
+            <w:tcW w:w="1434" w:type="dxa"/>
+          </w:tcPr>
+          <w:p>
+            <w:pPr>
+              <w:pStyle w:val="Piedepgina"/>
+              <w:jc w:val="both"/>
+              <w:rPr>
+                <w:rFonts w:ascii="Calibri" w:hAnsi="Calibri"/>
+              </w:rPr>
+            </w:pPr>
+            <w:r>
+              <w:t>Modelo YOLO entrenado para detección de patentes</w:t>
+            </w:r>
+          </w:p>
+        </w:tc>
+        <w:tc>
+          <w:tcPr>
+            <w:tcW w:w="3801" w:type="dxa"/>
+          </w:tcPr>
+          <w:p>
+            <w:pPr>
+              <w:spacing w:line="240" w:lineRule="auto"/>
+              <w:jc w:val="both"/>
+              <w:rPr>
+                <w:rFonts w:ascii="Calibri" w:hAnsi="Calibri" w:cs="Arial"/>
+                <w:i/>
+                <w:lang w:eastAsia="es-CL"/>
+              </w:rPr>
+            </w:pPr>
+            <w:r>
+              <w:t>Archivo del modelo entrenado mediante fine-</w:t>
             </w:r>
             <w:proofErr w:type="spellStart"/>
             <w:r>
-              <w:rPr>
-                <w:rFonts w:ascii="Calibri" w:hAnsi="Calibri" w:cs="Arial"/>
-                <w:b/>
-                <w:bCs/>
-                <w:iCs/>
-                <w:lang w:eastAsia="es-CL"/>
-              </w:rPr>
               <w:t>tuning</w:t>
             </w:r>
             <w:proofErr w:type="spellEnd"/>
             <w:r>
-              <w:rPr>
-                <w:rFonts w:ascii="Calibri" w:hAnsi="Calibri" w:cs="Arial"/>
-                <w:b/>
-                <w:bCs/>
-                <w:iCs/>
-                <w:lang w:eastAsia="es-CL"/>
-              </w:rPr>
-              <w:t>) del modelo YOLO para detección de patentes (Erick); sistema de autenticación y vistas base por rol (Brandon).</w:t>
-            </w:r>
-          </w:p>
-          <w:p>
-            <w:pPr>
-              <w:spacing w:line="240" w:lineRule="auto"/>
-              <w:jc w:val="both"/>
-              <w:rPr>
-                <w:rFonts w:ascii="Calibri" w:hAnsi="Calibri" w:cs="Arial"/>
-                <w:b/>
-                <w:bCs/>
-                <w:iCs/>
-                <w:lang w:eastAsia="es-CL"/>
-              </w:rPr>
-            </w:pPr>
-            <w:r>
-              <w:rPr>
-                <w:rFonts w:ascii="Calibri" w:hAnsi="Calibri" w:cs="Arial"/>
-                <w:b/>
-                <w:bCs/>
-                <w:iCs/>
-                <w:lang w:eastAsia="es-CL"/>
-              </w:rPr>
-              <w:t>Sprint 2: integración de OCR y validación de formato de patente (Erick); gestión de vehículos autorizados y de visita (Brandon).</w:t>
-            </w:r>
-          </w:p>
-          <w:p>
-            <w:pPr>
-              <w:spacing w:line="240" w:lineRule="auto"/>
-              <w:jc w:val="both"/>
-              <w:rPr>
-                <w:rFonts w:ascii="Calibri" w:hAnsi="Calibri" w:cs="Arial"/>
-                <w:b/>
-                <w:bCs/>
-                <w:iCs/>
-                <w:lang w:eastAsia="es-CL"/>
-              </w:rPr>
-            </w:pPr>
-            <w:r>
-              <w:rPr>
-                <w:rFonts w:ascii="Calibri" w:hAnsi="Calibri" w:cs="Arial"/>
-                <w:b/>
-                <w:bCs/>
-                <w:iCs/>
-                <w:lang w:eastAsia="es-CL"/>
-              </w:rPr>
-              <w:t>Sprint 3: integración de la cámara IP mediante RTSP/ONVIF (Erick); sistema de alertas en tiempo real (Brandon).</w:t>
-            </w:r>
-          </w:p>
-          <w:p>
-            <w:pPr>
-              <w:spacing w:line="240" w:lineRule="auto"/>
-              <w:jc w:val="both"/>
-              <w:rPr>
-                <w:rFonts w:ascii="Calibri" w:hAnsi="Calibri" w:cs="Arial"/>
-                <w:b/>
-                <w:bCs/>
-                <w:iCs/>
-                <w:lang w:eastAsia="es-CL"/>
-              </w:rPr>
-            </w:pPr>
-            <w:r>
-              <w:rPr>
-                <w:rFonts w:ascii="Calibri" w:hAnsi="Calibri" w:cs="Arial"/>
-                <w:b/>
-                <w:bCs/>
-                <w:iCs/>
-                <w:lang w:eastAsia="es-CL"/>
-              </w:rPr>
-              <w:t xml:space="preserve">Sprint 4 — Integración: conexión conjunta del pipeline de reconocimiento con el </w:t>
+              <w:t xml:space="preserve"> sobre el </w:t>
             </w:r>
             <w:proofErr w:type="spellStart"/>
             <w:r>
-              <w:rPr>
-                <w:rFonts w:ascii="Calibri" w:hAnsi="Calibri" w:cs="Arial"/>
-                <w:b/>
-                <w:bCs/>
-                <w:iCs/>
-                <w:lang w:eastAsia="es-CL"/>
-              </w:rPr>
-              <w:t>backend</w:t>
+              <w:t>dataset</w:t>
             </w:r>
             <w:proofErr w:type="spellEnd"/>
             <w:r>
-              <w:rPr>
-                <w:rFonts w:ascii="Calibri" w:hAnsi="Calibri" w:cs="Arial"/>
-                <w:b/>
-                <w:bCs/>
-                <w:iCs/>
-                <w:lang w:eastAsia="es-CL"/>
-              </w:rPr>
-              <w:t xml:space="preserve"> web, validando el resultado contra la base de datos y disparando alertas cuando corresponda.</w:t>
-            </w:r>
-          </w:p>
-          <w:p>
-            <w:pPr>
-              <w:spacing w:line="240" w:lineRule="auto"/>
-              <w:jc w:val="both"/>
-              <w:rPr>
-                <w:rFonts w:ascii="Calibri" w:hAnsi="Calibri" w:cs="Arial"/>
-                <w:b/>
-                <w:bCs/>
-                <w:iCs/>
-                <w:lang w:eastAsia="es-CL"/>
-              </w:rPr>
-            </w:pPr>
-            <w:r>
-              <w:rPr>
-                <w:rFonts w:ascii="Calibri" w:hAnsi="Calibri" w:cs="Arial"/>
-                <w:b/>
-                <w:bCs/>
-                <w:iCs/>
-                <w:lang w:eastAsia="es-CL"/>
-              </w:rPr>
-              <w:t>Sprint 5 — Cierre: pruebas en terreno con vehículos autorizados para calibración, corrección de errores y documentación final del proyecto.</w:t>
-            </w:r>
-          </w:p>
-          <w:p>
-            <w:pPr>
-              <w:spacing w:line="240" w:lineRule="auto"/>
-              <w:jc w:val="both"/>
-              <w:rPr>
-                <w:rFonts w:ascii="Calibri" w:hAnsi="Calibri" w:cs="Arial"/>
-                <w:b/>
-                <w:bCs/>
-                <w:iCs/>
-                <w:lang w:eastAsia="es-CL"/>
-              </w:rPr>
-            </w:pPr>
-            <w:r>
-              <w:rPr>
-                <w:rFonts w:ascii="Calibri" w:hAnsi="Calibri" w:cs="Arial"/>
-                <w:b/>
-                <w:bCs/>
-                <w:iCs/>
-                <w:lang w:eastAsia="es-CL"/>
-              </w:rPr>
-              <w:t>El diseño de las pruebas de validación considera criterios concretos de éxito: tasa de acierto en la detección de patentes por parte del modelo YOLO, precisión del texto extraído por el OCR frente al valor real de la patente, y tiempo de respuesta del pipeline completo desde la captura hasta la validación. Estas pruebas se aplican sobre los vehículos autorizados para la calibración del sistema, comparando el resultado obtenido contra el resultado esperado en cada caso.</w:t>
-            </w:r>
-          </w:p>
-          <w:p>
-            <w:pPr>
-              <w:spacing w:line="240" w:lineRule="auto"/>
-              <w:jc w:val="both"/>
-              <w:rPr>
-                <w:rFonts w:ascii="Calibri" w:hAnsi="Calibri" w:cs="Arial"/>
-                <w:b/>
-                <w:bCs/>
-                <w:iCs/>
-                <w:lang w:eastAsia="es-CL"/>
-              </w:rPr>
-            </w:pPr>
-            <w:r>
-              <w:rPr>
-                <w:rFonts w:ascii="Calibri" w:hAnsi="Calibri" w:cs="Arial"/>
-                <w:b/>
-                <w:bCs/>
-                <w:iCs/>
-                <w:lang w:eastAsia="es-CL"/>
-              </w:rPr>
-              <w:t>El control del avance del proyecto se realiza mediante revisiones semanales entre ambos integrantes, comparando el trabajo realizado contra lo planificado en la Carta Gantt para cada sprint. Este seguimiento permite detectar oportunamente desviaciones respecto a la planificación y tomar decisiones de ajuste, como redistribuir tareas o modificar el alcance de un sprint en caso de que sea necesario.</w:t>
-            </w:r>
-          </w:p>
-          <w:p>
-            <w:pPr>
-              <w:spacing w:line="240" w:lineRule="auto"/>
-              <w:jc w:val="both"/>
-              <w:rPr>
-                <w:rFonts w:ascii="Calibri" w:hAnsi="Calibri" w:cs="Arial"/>
-                <w:b/>
-                <w:bCs/>
-                <w:iCs/>
-                <w:lang w:eastAsia="es-CL"/>
-              </w:rPr>
-            </w:pPr>
-            <w:r>
-              <w:rPr>
-                <w:rFonts w:ascii="Calibri" w:hAnsi="Calibri" w:cs="Arial"/>
-                <w:b/>
-                <w:bCs/>
-                <w:iCs/>
-                <w:lang w:eastAsia="es-CL"/>
-              </w:rPr>
-              <w:t>Funciones y responsabilidades por integrante:</w:t>
-            </w:r>
-          </w:p>
-          <w:p>
-            <w:pPr>
-              <w:spacing w:line="240" w:lineRule="auto"/>
-              <w:jc w:val="both"/>
-              <w:rPr>
-                <w:rFonts w:ascii="Calibri" w:hAnsi="Calibri" w:cs="Arial"/>
-                <w:b/>
-                <w:bCs/>
-                <w:iCs/>
-                <w:lang w:eastAsia="es-CL"/>
-              </w:rPr>
-            </w:pPr>
-            <w:r>
-              <w:rPr>
-                <w:rFonts w:ascii="Calibri" w:hAnsi="Calibri" w:cs="Arial"/>
-                <w:b/>
-                <w:bCs/>
-                <w:iCs/>
-                <w:lang w:eastAsia="es-CL"/>
-              </w:rPr>
-              <w:t>Erick: diseño del modelo de datos, entrenamiento y ajuste del modelo de Machine Learning, e integración de la cámara IP.</w:t>
-            </w:r>
-          </w:p>
-          <w:p>
-            <w:pPr>
-              <w:spacing w:line="240" w:lineRule="auto"/>
-              <w:jc w:val="both"/>
-              <w:rPr>
-                <w:rFonts w:ascii="Calibri" w:hAnsi="Calibri" w:cs="Arial"/>
-                <w:b/>
-                <w:bCs/>
-                <w:iCs/>
-                <w:lang w:eastAsia="es-CL"/>
-              </w:rPr>
-            </w:pPr>
-            <w:r>
-              <w:rPr>
-                <w:rFonts w:ascii="Calibri" w:hAnsi="Calibri" w:cs="Arial"/>
-                <w:b/>
-                <w:bCs/>
-                <w:iCs/>
-                <w:lang w:eastAsia="es-CL"/>
-              </w:rPr>
-              <w:t>Brandon: desarrollo de la aplicación web (vistas y perfiles por rol), implementación del sistema de alertas en tiempo real, y documentación del proyecto.</w:t>
+              <w:t xml:space="preserve"> público, acompañado de gráficos de métricas de entrenamiento (precisión, </w:t>
+            </w:r>
+            <w:proofErr w:type="spellStart"/>
+            <w:r>
+              <w:t>recall</w:t>
+            </w:r>
+            <w:proofErr w:type="spellEnd"/>
+            <w:r>
+              <w:t xml:space="preserve">, </w:t>
+            </w:r>
+            <w:proofErr w:type="spellStart"/>
+            <w:r>
+              <w:t>mAP</w:t>
+            </w:r>
+            <w:proofErr w:type="spellEnd"/>
+            <w:r>
+              <w:t xml:space="preserve">) e imágenes de ejemplo mostrando el </w:t>
+            </w:r>
+            <w:proofErr w:type="spellStart"/>
+            <w:r>
+              <w:t>bounding</w:t>
+            </w:r>
+            <w:proofErr w:type="spellEnd"/>
+            <w:r>
+              <w:t xml:space="preserve"> box detectado sobre la patente.</w:t>
+            </w:r>
+          </w:p>
+        </w:tc>
+        <w:tc>
+          <w:tcPr>
+            <w:tcW w:w="2985" w:type="dxa"/>
+          </w:tcPr>
+          <w:p>
+            <w:pPr>
+              <w:pStyle w:val="Piedepgina"/>
+              <w:jc w:val="both"/>
+              <w:rPr>
+                <w:rFonts w:ascii="Calibri" w:hAnsi="Calibri"/>
+              </w:rPr>
+            </w:pPr>
+            <w:r>
+              <w:t>Las métricas cuantifican objetivamente el desempeño del modelo de detección, mientras que las imágenes permiten verificar visualmente que efectivamente localiza patentes de forma correcta.</w:t>
+            </w:r>
+          </w:p>
+        </w:tc>
+      </w:tr>
+      <w:tr>
+        <w:trPr>
+          <w:trHeight w:val="362"/>
+        </w:trPr>
+        <w:tc>
+          <w:tcPr>
+            <w:tcW w:w="1995" w:type="dxa"/>
+          </w:tcPr>
+          <w:p>
+            <w:pPr>
+              <w:pStyle w:val="Piedepgina"/>
+              <w:jc w:val="both"/>
+              <w:rPr>
+                <w:rFonts w:ascii="Calibri" w:hAnsi="Calibri"/>
+              </w:rPr>
+            </w:pPr>
+            <w:r>
+              <w:t>Avance</w:t>
+            </w:r>
+          </w:p>
+        </w:tc>
+        <w:tc>
+          <w:tcPr>
+            <w:tcW w:w="1434" w:type="dxa"/>
+          </w:tcPr>
+          <w:p>
+            <w:pPr>
+              <w:pStyle w:val="Piedepgina"/>
+              <w:jc w:val="both"/>
+              <w:rPr>
+                <w:rFonts w:ascii="Calibri" w:hAnsi="Calibri"/>
+              </w:rPr>
+            </w:pPr>
+            <w:r>
+              <w:t>Módulo de OCR para lectura de caracteres</w:t>
+            </w:r>
+          </w:p>
+        </w:tc>
+        <w:tc>
+          <w:tcPr>
+            <w:tcW w:w="3801" w:type="dxa"/>
+          </w:tcPr>
+          <w:p>
+            <w:pPr>
+              <w:pStyle w:val="Piedepgina"/>
+              <w:jc w:val="both"/>
+              <w:rPr>
+                <w:rFonts w:ascii="Calibri" w:hAnsi="Calibri"/>
+              </w:rPr>
+            </w:pPr>
+            <w:r>
+              <w:t>Evidencia del proceso de extracción de texto a partir de la imagen recortada de la patente detectada, incluyendo ejemplos de entrada (imagen recortada) y salida (texto extraído) bajo distintas condiciones de iluminación y ángulo.</w:t>
+            </w:r>
+          </w:p>
+        </w:tc>
+        <w:tc>
+          <w:tcPr>
+            <w:tcW w:w="2985" w:type="dxa"/>
+          </w:tcPr>
+          <w:p>
+            <w:pPr>
+              <w:pStyle w:val="Piedepgina"/>
+              <w:jc w:val="both"/>
+              <w:rPr>
+                <w:rFonts w:ascii="Calibri" w:hAnsi="Calibri"/>
+              </w:rPr>
+            </w:pPr>
+            <w:r>
+              <w:t>Demuestra que el sistema es capaz de convertir la imagen de la patente detectada en texto legible, paso intermedio indispensable del pipeline.</w:t>
+            </w:r>
+          </w:p>
+        </w:tc>
+      </w:tr>
+      <w:tr>
+        <w:trPr>
+          <w:trHeight w:val="362"/>
+        </w:trPr>
+        <w:tc>
+          <w:tcPr>
+            <w:tcW w:w="1995" w:type="dxa"/>
+          </w:tcPr>
+          <w:p>
+            <w:pPr>
+              <w:pStyle w:val="Piedepgina"/>
+              <w:jc w:val="both"/>
+              <w:rPr>
+                <w:rFonts w:ascii="Calibri" w:hAnsi="Calibri"/>
+              </w:rPr>
+            </w:pPr>
+            <w:r>
+              <w:t>Avance</w:t>
+            </w:r>
+          </w:p>
+        </w:tc>
+        <w:tc>
+          <w:tcPr>
+            <w:tcW w:w="1434" w:type="dxa"/>
+          </w:tcPr>
+          <w:p>
+            <w:pPr>
+              <w:pStyle w:val="Piedepgina"/>
+              <w:jc w:val="both"/>
+              <w:rPr>
+                <w:rFonts w:ascii="Calibri" w:hAnsi="Calibri"/>
+              </w:rPr>
+            </w:pPr>
+            <w:r>
+              <w:t>Raspberry Pi y cámara integradas</w:t>
+            </w:r>
+          </w:p>
+        </w:tc>
+        <w:tc>
+          <w:tcPr>
+            <w:tcW w:w="3801" w:type="dxa"/>
+          </w:tcPr>
+          <w:p>
+            <w:pPr>
+              <w:pStyle w:val="Piedepgina"/>
+              <w:jc w:val="both"/>
+              <w:rPr>
+                <w:rFonts w:ascii="Calibri" w:hAnsi="Calibri"/>
+              </w:rPr>
+            </w:pPr>
+            <w:r>
+              <w:t>Registro de configuración, conexión de la Tapo C310, recepción del flujo de video y ejecución del procesamiento en la Raspberry Pi.</w:t>
+            </w:r>
+          </w:p>
+        </w:tc>
+        <w:tc>
+          <w:tcPr>
+            <w:tcW w:w="2985" w:type="dxa"/>
+          </w:tcPr>
+          <w:p>
+            <w:pPr>
+              <w:pStyle w:val="Piedepgina"/>
+              <w:jc w:val="both"/>
+              <w:rPr>
+                <w:rFonts w:ascii="Calibri" w:hAnsi="Calibri"/>
+              </w:rPr>
+            </w:pPr>
+            <w:r>
+              <w:t>Demuestra la integración real del hardware definido para el proyecto.</w:t>
+            </w:r>
+          </w:p>
+        </w:tc>
+      </w:tr>
+      <w:tr>
+        <w:trPr>
+          <w:trHeight w:val="362"/>
+        </w:trPr>
+        <w:tc>
+          <w:tcPr>
+            <w:tcW w:w="1995" w:type="dxa"/>
+          </w:tcPr>
+          <w:p>
+            <w:pPr>
+              <w:pStyle w:val="Piedepgina"/>
+              <w:jc w:val="both"/>
+              <w:rPr>
+                <w:rFonts w:ascii="Calibri" w:hAnsi="Calibri"/>
+              </w:rPr>
+            </w:pPr>
+            <w:r>
+              <w:t>Avance</w:t>
+            </w:r>
+          </w:p>
+        </w:tc>
+        <w:tc>
+          <w:tcPr>
+            <w:tcW w:w="1434" w:type="dxa"/>
+          </w:tcPr>
+          <w:p>
+            <w:pPr>
+              <w:pStyle w:val="Piedepgina"/>
+              <w:jc w:val="both"/>
+              <w:rPr>
+                <w:rFonts w:ascii="Calibri" w:hAnsi="Calibri"/>
+              </w:rPr>
+            </w:pPr>
+            <w:r>
+              <w:t>Aplicación web con autenticación y vistas por rol</w:t>
+            </w:r>
+          </w:p>
+        </w:tc>
+        <w:tc>
+          <w:tcPr>
+            <w:tcW w:w="3801" w:type="dxa"/>
+          </w:tcPr>
+          <w:p>
+            <w:pPr>
+              <w:pStyle w:val="Piedepgina"/>
+              <w:jc w:val="both"/>
+              <w:rPr>
+                <w:rFonts w:ascii="Calibri" w:hAnsi="Calibri"/>
+              </w:rPr>
+            </w:pPr>
+            <w:r>
+              <w:t>Sistema funcional con login y vistas diferenciadas para Administrador, Propietario y Guardia.</w:t>
+            </w:r>
+          </w:p>
+        </w:tc>
+        <w:tc>
+          <w:tcPr>
+            <w:tcW w:w="2985" w:type="dxa"/>
+          </w:tcPr>
+          <w:p>
+            <w:pPr>
+              <w:pStyle w:val="Piedepgina"/>
+              <w:jc w:val="both"/>
+              <w:rPr>
+                <w:rFonts w:ascii="Calibri" w:hAnsi="Calibri"/>
+              </w:rPr>
+            </w:pPr>
+            <w:r>
+              <w:t>Evidencia el desarrollo paralelo de la plataforma web, permitiendo verificar que la estructura de roles definida en el diseño se implementó correctamente.</w:t>
+            </w:r>
+          </w:p>
+        </w:tc>
+      </w:tr>
+      <w:tr>
+        <w:trPr>
+          <w:trHeight w:val="362"/>
+        </w:trPr>
+        <w:tc>
+          <w:tcPr>
+            <w:tcW w:w="1995" w:type="dxa"/>
+          </w:tcPr>
+          <w:p>
+            <w:pPr>
+              <w:pStyle w:val="Piedepgina"/>
+              <w:jc w:val="both"/>
+              <w:rPr>
+                <w:rFonts w:ascii="Calibri" w:hAnsi="Calibri"/>
+              </w:rPr>
+            </w:pPr>
+            <w:r>
+              <w:t>Avance</w:t>
+            </w:r>
+          </w:p>
+        </w:tc>
+        <w:tc>
+          <w:tcPr>
+            <w:tcW w:w="1434" w:type="dxa"/>
+          </w:tcPr>
+          <w:p>
+            <w:pPr>
+              <w:pStyle w:val="Piedepgina"/>
+              <w:jc w:val="both"/>
+              <w:rPr>
+                <w:rFonts w:ascii="Calibri" w:hAnsi="Calibri"/>
+              </w:rPr>
+            </w:pPr>
+            <w:r>
+              <w:t xml:space="preserve">Registro de </w:t>
+            </w:r>
+            <w:proofErr w:type="spellStart"/>
+            <w:r>
+              <w:t>commits</w:t>
+            </w:r>
+            <w:proofErr w:type="spellEnd"/>
+            <w:r>
+              <w:t xml:space="preserve"> en GitHub</w:t>
+            </w:r>
+          </w:p>
+        </w:tc>
+        <w:tc>
+          <w:tcPr>
+            <w:tcW w:w="3801" w:type="dxa"/>
+          </w:tcPr>
+          <w:p>
+            <w:pPr>
+              <w:pStyle w:val="Piedepgina"/>
+              <w:jc w:val="both"/>
+              <w:rPr>
+                <w:rFonts w:ascii="Calibri" w:hAnsi="Calibri"/>
+              </w:rPr>
+            </w:pPr>
+            <w:r>
+              <w:t xml:space="preserve">Historial de </w:t>
+            </w:r>
+            <w:proofErr w:type="spellStart"/>
+            <w:r>
+              <w:t>commits</w:t>
+            </w:r>
+            <w:proofErr w:type="spellEnd"/>
+            <w:r>
+              <w:t xml:space="preserve"> del repositorio público del proyecto, diferenciado por integrante.</w:t>
+            </w:r>
+          </w:p>
+        </w:tc>
+        <w:tc>
+          <w:tcPr>
+            <w:tcW w:w="2985" w:type="dxa"/>
+          </w:tcPr>
+          <w:p>
+            <w:pPr>
+              <w:pStyle w:val="Piedepgina"/>
+              <w:jc w:val="both"/>
+              <w:rPr>
+                <w:rFonts w:ascii="Calibri" w:hAnsi="Calibri"/>
+              </w:rPr>
+            </w:pPr>
+            <w:r>
+              <w:t>Permite verificar el trabajo continuo y la contribución individual de cada integrante durante el desarrollo.</w:t>
+            </w:r>
+          </w:p>
+        </w:tc>
+      </w:tr>
+      <w:tr>
+        <w:trPr>
+          <w:trHeight w:val="362"/>
+        </w:trPr>
+        <w:tc>
+          <w:tcPr>
+            <w:tcW w:w="1995" w:type="dxa"/>
+          </w:tcPr>
+          <w:p>
+            <w:pPr>
+              <w:pStyle w:val="Piedepgina"/>
+              <w:jc w:val="both"/>
+              <w:rPr>
+                <w:rFonts w:ascii="Calibri" w:hAnsi="Calibri"/>
+              </w:rPr>
+            </w:pPr>
+            <w:r>
+              <w:t>Final</w:t>
+            </w:r>
+          </w:p>
+        </w:tc>
+        <w:tc>
+          <w:tcPr>
+            <w:tcW w:w="1434" w:type="dxa"/>
+          </w:tcPr>
+          <w:p>
+            <w:pPr>
+              <w:pStyle w:val="Piedepgina"/>
+              <w:jc w:val="both"/>
+              <w:rPr>
+                <w:rFonts w:ascii="Calibri" w:hAnsi="Calibri"/>
+              </w:rPr>
+            </w:pPr>
+            <w:r>
+              <w:t>Sistema integrado funcionando end-to-end</w:t>
+            </w:r>
+          </w:p>
+        </w:tc>
+        <w:tc>
+          <w:tcPr>
+            <w:tcW w:w="3801" w:type="dxa"/>
+          </w:tcPr>
+          <w:p>
+            <w:pPr>
+              <w:pStyle w:val="Piedepgina"/>
+              <w:jc w:val="both"/>
+              <w:rPr>
+                <w:rFonts w:ascii="Calibri" w:hAnsi="Calibri"/>
+              </w:rPr>
+            </w:pPr>
+            <w:r>
+              <w:t>Sistema completo: cámara capturando video, detección y OCR de patentes, validación contra base de datos, y alertas en la interfaz del Guardia.</w:t>
+            </w:r>
+          </w:p>
+        </w:tc>
+        <w:tc>
+          <w:tcPr>
+            <w:tcW w:w="2985" w:type="dxa"/>
+          </w:tcPr>
+          <w:p>
+            <w:pPr>
+              <w:pStyle w:val="Piedepgina"/>
+              <w:jc w:val="both"/>
+              <w:rPr>
+                <w:rFonts w:ascii="Calibri" w:hAnsi="Calibri"/>
+              </w:rPr>
+            </w:pPr>
+            <w:r>
+              <w:t>Es la evidencia principal que demuestra el cumplimiento del objetivo general del proyecto.</w:t>
+            </w:r>
+          </w:p>
+        </w:tc>
+      </w:tr>
+      <w:tr>
+        <w:trPr>
+          <w:trHeight w:val="362"/>
+        </w:trPr>
+        <w:tc>
+          <w:tcPr>
+            <w:tcW w:w="1995" w:type="dxa"/>
+          </w:tcPr>
+          <w:p>
+            <w:pPr>
+              <w:pStyle w:val="Piedepgina"/>
+              <w:jc w:val="both"/>
+              <w:rPr>
+                <w:rFonts w:ascii="Calibri" w:hAnsi="Calibri"/>
+              </w:rPr>
+            </w:pPr>
+            <w:r>
+              <w:t>Final</w:t>
+            </w:r>
+          </w:p>
+        </w:tc>
+        <w:tc>
+          <w:tcPr>
+            <w:tcW w:w="1434" w:type="dxa"/>
+          </w:tcPr>
+          <w:p>
+            <w:pPr>
+              <w:pStyle w:val="Piedepgina"/>
+              <w:jc w:val="both"/>
+              <w:rPr>
+                <w:rFonts w:ascii="Calibri" w:hAnsi="Calibri"/>
+              </w:rPr>
+            </w:pPr>
+            <w:r>
+              <w:t>Resultados de pruebas en terreno</w:t>
+            </w:r>
+          </w:p>
+        </w:tc>
+        <w:tc>
+          <w:tcPr>
+            <w:tcW w:w="3801" w:type="dxa"/>
+          </w:tcPr>
+          <w:p>
+            <w:pPr>
+              <w:pStyle w:val="Piedepgina"/>
+              <w:jc w:val="both"/>
+              <w:rPr>
+                <w:rFonts w:ascii="Calibri" w:hAnsi="Calibri"/>
+              </w:rPr>
+            </w:pPr>
+            <w:r>
+              <w:t>Registro de pruebas realizadas con los vehículos autorizados para calibración (aciertos, errores, condiciones de prueba).</w:t>
+            </w:r>
+          </w:p>
+        </w:tc>
+        <w:tc>
+          <w:tcPr>
+            <w:tcW w:w="2985" w:type="dxa"/>
+          </w:tcPr>
+          <w:p>
+            <w:pPr>
+              <w:pStyle w:val="Piedepgina"/>
+              <w:jc w:val="both"/>
+              <w:rPr>
+                <w:rFonts w:ascii="Calibri" w:hAnsi="Calibri"/>
+              </w:rPr>
+            </w:pPr>
+            <w:r>
+              <w:t>Justifica la validación real del sistema fuera de un entorno controlado, dando cuenta de su funcionamiento efectivo.</w:t>
             </w:r>
           </w:p>
         </w:tc>
@@ -3650,1217 +4446,7 @@
                 <w:sz w:val="28"/>
                 <w:szCs w:val="28"/>
               </w:rPr>
-              <w:t>6</w:t>
-            </w:r>
-            <w:r>
-              <w:rPr>
-                <w:b/>
-                <w:color w:val="1F3864" w:themeColor="accent1" w:themeShade="80"/>
-                <w:sz w:val="28"/>
-                <w:szCs w:val="28"/>
-              </w:rPr>
-              <w:t xml:space="preserve">. </w:t>
-            </w:r>
-            <w:r>
-              <w:rPr>
-                <w:b/>
-                <w:color w:val="1F3864" w:themeColor="accent1" w:themeShade="80"/>
-                <w:sz w:val="28"/>
-                <w:szCs w:val="28"/>
-              </w:rPr>
-              <w:t>Evidencias</w:t>
-            </w:r>
-          </w:p>
-        </w:tc>
-      </w:tr>
-      <w:tr>
-        <w:trPr>
-          <w:trHeight w:val="440"/>
-        </w:trPr>
-        <w:tc>
-          <w:tcPr>
-            <w:tcW w:w="9640" w:type="dxa"/>
-            <w:shd w:val="clear" w:color="auto" w:fill="D9E2F3" w:themeFill="accent1" w:themeFillTint="33"/>
-            <w:vAlign w:val="center"/>
-          </w:tcPr>
-          <w:p>
-            <w:pPr>
-              <w:spacing w:after="0" w:line="240" w:lineRule="auto"/>
-              <w:jc w:val="both"/>
-              <w:rPr>
-                <w:rFonts w:eastAsia="Times New Roman" w:cs="Times New Roman"/>
-                <w:color w:val="595959" w:themeColor="text1" w:themeTint="A6"/>
-                <w:lang w:eastAsia="es-CL"/>
-              </w:rPr>
-            </w:pPr>
-            <w:r>
-              <w:rPr>
-                <w:rFonts w:ascii="Calibri" w:hAnsi="Calibri"/>
-                <w:color w:val="1F3864" w:themeColor="accent1" w:themeShade="80"/>
-              </w:rPr>
-              <w:t>A continuación, d</w:t>
-            </w:r>
-            <w:r>
-              <w:rPr>
-                <w:rFonts w:ascii="Calibri" w:hAnsi="Calibri"/>
-                <w:color w:val="1F3864" w:themeColor="accent1" w:themeShade="80"/>
-              </w:rPr>
-              <w:t xml:space="preserve">escribe qué evidencias serán evaluadas en el informe de avance y en el informe final de tu proyecto APT. Estas evidencias deben ser acordadas con tu docente. </w:t>
-            </w:r>
-            <w:r>
-              <w:t xml:space="preserve"> Se entenderá por evidencia los productos que se desarrollen durante el proyecto y cuyo propósito sea </w:t>
-            </w:r>
-            <w:r>
-              <w:t xml:space="preserve">visibilizar o </w:t>
-            </w:r>
-            <w:r>
-              <w:t xml:space="preserve">documentar cómo se ha implementado el trabajo. </w:t>
-            </w:r>
-            <w:r>
-              <w:rPr>
-                <w:rFonts w:eastAsia="Times New Roman" w:cs="Times New Roman"/>
-                <w:color w:val="595959" w:themeColor="text1" w:themeTint="A6"/>
-                <w:lang w:eastAsia="es-CL"/>
-              </w:rPr>
-              <w:t xml:space="preserve"> </w:t>
-            </w:r>
-          </w:p>
-        </w:tc>
-      </w:tr>
-    </w:tbl>
-    <w:p>
-      <w:pPr>
-        <w:spacing w:after="0" w:line="240" w:lineRule="auto"/>
-        <w:jc w:val="both"/>
-        <w:rPr>
-          <w:b/>
-          <w:sz w:val="24"/>
-          <w:szCs w:val="24"/>
-        </w:rPr>
-      </w:pPr>
-    </w:p>
-    <w:tbl>
-      <w:tblPr>
-        <w:tblStyle w:val="Tablaconcuadrcula"/>
-        <w:tblW w:w="10062" w:type="dxa"/>
-        <w:tblInd w:w="-714" w:type="dxa"/>
-        <w:tblBorders>
-          <w:top w:val="single" w:sz="4" w:space="0" w:color="BFBFBF" w:themeColor="background1" w:themeShade="BF"/>
-          <w:left w:val="single" w:sz="4" w:space="0" w:color="BFBFBF" w:themeColor="background1" w:themeShade="BF"/>
-          <w:bottom w:val="single" w:sz="4" w:space="0" w:color="BFBFBF" w:themeColor="background1" w:themeShade="BF"/>
-          <w:right w:val="single" w:sz="4" w:space="0" w:color="BFBFBF" w:themeColor="background1" w:themeShade="BF"/>
-          <w:insideH w:val="single" w:sz="4" w:space="0" w:color="BFBFBF" w:themeColor="background1" w:themeShade="BF"/>
-          <w:insideV w:val="single" w:sz="4" w:space="0" w:color="BFBFBF" w:themeColor="background1" w:themeShade="BF"/>
-        </w:tblBorders>
-        <w:tblLook w:val="04A0" w:firstRow="1" w:lastRow="0" w:firstColumn="1" w:lastColumn="0" w:noHBand="0" w:noVBand="1"/>
-      </w:tblPr>
-      <w:tblGrid>
-        <w:gridCol w:w="1843"/>
-        <w:gridCol w:w="1843"/>
-        <w:gridCol w:w="3825"/>
-        <w:gridCol w:w="2551"/>
-      </w:tblGrid>
-      <w:tr>
-        <w:trPr>
-          <w:trHeight w:val="362"/>
-        </w:trPr>
-        <w:tc>
-          <w:tcPr>
-            <w:tcW w:w="1843" w:type="dxa"/>
-            <w:vAlign w:val="center"/>
-          </w:tcPr>
-          <w:p>
-            <w:pPr>
-              <w:pStyle w:val="Piedepgina"/>
-              <w:jc w:val="both"/>
-              <w:rPr>
-                <w:rFonts w:ascii="Calibri" w:hAnsi="Calibri"/>
-                <w:b/>
-                <w:color w:val="1F3864" w:themeColor="accent1" w:themeShade="80"/>
-              </w:rPr>
-            </w:pPr>
-            <w:r>
-              <w:rPr>
-                <w:rFonts w:ascii="Calibri" w:hAnsi="Calibri"/>
-                <w:b/>
-                <w:color w:val="1F3864" w:themeColor="accent1" w:themeShade="80"/>
-              </w:rPr>
-              <w:t xml:space="preserve">Tipo de evidencia </w:t>
-            </w:r>
-          </w:p>
-          <w:p>
-            <w:pPr>
-              <w:pStyle w:val="Piedepgina"/>
-              <w:jc w:val="both"/>
-              <w:rPr>
-                <w:rFonts w:ascii="Calibri" w:hAnsi="Calibri"/>
-                <w:b/>
-                <w:color w:val="1F3864" w:themeColor="accent1" w:themeShade="80"/>
-              </w:rPr>
-            </w:pPr>
-            <w:r>
-              <w:rPr>
-                <w:rFonts w:ascii="Calibri" w:hAnsi="Calibri"/>
-                <w:b/>
-                <w:color w:val="1F3864" w:themeColor="accent1" w:themeShade="80"/>
-              </w:rPr>
-              <w:t>(avance o final)</w:t>
-            </w:r>
-          </w:p>
-        </w:tc>
-        <w:tc>
-          <w:tcPr>
-            <w:tcW w:w="1843" w:type="dxa"/>
-            <w:vAlign w:val="center"/>
-          </w:tcPr>
-          <w:p>
-            <w:pPr>
-              <w:pStyle w:val="Piedepgina"/>
-              <w:jc w:val="both"/>
-              <w:rPr>
-                <w:rFonts w:ascii="Calibri" w:hAnsi="Calibri"/>
-                <w:b/>
-                <w:color w:val="1F3864" w:themeColor="accent1" w:themeShade="80"/>
-              </w:rPr>
-            </w:pPr>
-            <w:r>
-              <w:rPr>
-                <w:rFonts w:ascii="Calibri" w:hAnsi="Calibri"/>
-                <w:b/>
-                <w:color w:val="1F3864" w:themeColor="accent1" w:themeShade="80"/>
-              </w:rPr>
-              <w:t>Nombre de la evidencia</w:t>
-            </w:r>
-          </w:p>
-        </w:tc>
-        <w:tc>
-          <w:tcPr>
-            <w:tcW w:w="3825" w:type="dxa"/>
-            <w:vAlign w:val="center"/>
-          </w:tcPr>
-          <w:p>
-            <w:pPr>
-              <w:pStyle w:val="Piedepgina"/>
-              <w:jc w:val="both"/>
-              <w:rPr>
-                <w:rFonts w:ascii="Calibri" w:hAnsi="Calibri"/>
-                <w:b/>
-                <w:color w:val="1F3864" w:themeColor="accent1" w:themeShade="80"/>
-              </w:rPr>
-            </w:pPr>
-            <w:r>
-              <w:rPr>
-                <w:rFonts w:ascii="Calibri" w:hAnsi="Calibri"/>
-                <w:b/>
-                <w:color w:val="1F3864" w:themeColor="accent1" w:themeShade="80"/>
-              </w:rPr>
-              <w:t>Descripción</w:t>
-            </w:r>
-          </w:p>
-        </w:tc>
-        <w:tc>
-          <w:tcPr>
-            <w:tcW w:w="2551" w:type="dxa"/>
-            <w:vAlign w:val="center"/>
-          </w:tcPr>
-          <w:p>
-            <w:pPr>
-              <w:pStyle w:val="Piedepgina"/>
-              <w:jc w:val="both"/>
-              <w:rPr>
-                <w:rFonts w:ascii="Calibri" w:hAnsi="Calibri"/>
-                <w:b/>
-                <w:color w:val="1F3864" w:themeColor="accent1" w:themeShade="80"/>
-              </w:rPr>
-            </w:pPr>
-            <w:r>
-              <w:rPr>
-                <w:rFonts w:ascii="Calibri" w:hAnsi="Calibri"/>
-                <w:b/>
-                <w:color w:val="1F3864" w:themeColor="accent1" w:themeShade="80"/>
-              </w:rPr>
-              <w:t>Justificación</w:t>
-            </w:r>
-          </w:p>
-        </w:tc>
-      </w:tr>
-      <w:tr>
-        <w:trPr>
-          <w:trHeight w:val="362"/>
-        </w:trPr>
-        <w:tc>
-          <w:tcPr>
-            <w:tcW w:w="1843" w:type="dxa"/>
-          </w:tcPr>
-          <w:p>
-            <w:pPr>
-              <w:pStyle w:val="Piedepgina"/>
-              <w:jc w:val="both"/>
-              <w:rPr>
-                <w:rFonts w:ascii="Calibri" w:hAnsi="Calibri"/>
-                <w:b/>
-                <w:bCs/>
-              </w:rPr>
-            </w:pPr>
-            <w:r>
-              <w:rPr>
-                <w:b/>
-                <w:bCs/>
-              </w:rPr>
-              <w:t>Avance</w:t>
-            </w:r>
-          </w:p>
-        </w:tc>
-        <w:tc>
-          <w:tcPr>
-            <w:tcW w:w="1843" w:type="dxa"/>
-          </w:tcPr>
-          <w:p>
-            <w:pPr>
-              <w:pStyle w:val="Piedepgina"/>
-              <w:jc w:val="both"/>
-              <w:rPr>
-                <w:rFonts w:ascii="Calibri" w:hAnsi="Calibri"/>
-                <w:b/>
-                <w:bCs/>
-              </w:rPr>
-            </w:pPr>
-            <w:r>
-              <w:rPr>
-                <w:b/>
-                <w:bCs/>
-              </w:rPr>
-              <w:t>Modelo YOLO entrenado para detección de patentes</w:t>
-            </w:r>
-          </w:p>
-        </w:tc>
-        <w:tc>
-          <w:tcPr>
-            <w:tcW w:w="3825" w:type="dxa"/>
-          </w:tcPr>
-          <w:p>
-            <w:pPr>
-              <w:spacing w:line="240" w:lineRule="auto"/>
-              <w:jc w:val="both"/>
-              <w:rPr>
-                <w:rFonts w:ascii="Calibri" w:hAnsi="Calibri" w:cs="Arial"/>
-                <w:b/>
-                <w:bCs/>
-                <w:i/>
-                <w:lang w:eastAsia="es-CL"/>
-              </w:rPr>
-            </w:pPr>
-            <w:r>
-              <w:rPr>
-                <w:b/>
-                <w:bCs/>
-              </w:rPr>
-              <w:t>Archivo del modelo entrenado mediante fine-</w:t>
-            </w:r>
-            <w:proofErr w:type="spellStart"/>
-            <w:r>
-              <w:rPr>
-                <w:b/>
-                <w:bCs/>
-              </w:rPr>
-              <w:t>tuning</w:t>
-            </w:r>
-            <w:proofErr w:type="spellEnd"/>
-            <w:r>
-              <w:rPr>
-                <w:b/>
-                <w:bCs/>
-              </w:rPr>
-              <w:t xml:space="preserve"> sobre el </w:t>
-            </w:r>
-            <w:proofErr w:type="spellStart"/>
-            <w:r>
-              <w:rPr>
-                <w:b/>
-                <w:bCs/>
-              </w:rPr>
-              <w:t>dataset</w:t>
-            </w:r>
-            <w:proofErr w:type="spellEnd"/>
-            <w:r>
-              <w:rPr>
-                <w:b/>
-                <w:bCs/>
-              </w:rPr>
-              <w:t xml:space="preserve"> público, acompañado de gráficos de métricas de entrenamiento (precisión, </w:t>
-            </w:r>
-            <w:proofErr w:type="spellStart"/>
-            <w:r>
-              <w:rPr>
-                <w:b/>
-                <w:bCs/>
-              </w:rPr>
-              <w:t>recall</w:t>
-            </w:r>
-            <w:proofErr w:type="spellEnd"/>
-            <w:r>
-              <w:rPr>
-                <w:b/>
-                <w:bCs/>
-              </w:rPr>
-              <w:t xml:space="preserve">, </w:t>
-            </w:r>
-            <w:proofErr w:type="spellStart"/>
-            <w:r>
-              <w:rPr>
-                <w:b/>
-                <w:bCs/>
-              </w:rPr>
-              <w:t>mAP</w:t>
-            </w:r>
-            <w:proofErr w:type="spellEnd"/>
-            <w:r>
-              <w:rPr>
-                <w:b/>
-                <w:bCs/>
-              </w:rPr>
-              <w:t xml:space="preserve">) e imágenes de ejemplo mostrando el </w:t>
-            </w:r>
-            <w:proofErr w:type="spellStart"/>
-            <w:r>
-              <w:rPr>
-                <w:b/>
-                <w:bCs/>
-              </w:rPr>
-              <w:t>bounding</w:t>
-            </w:r>
-            <w:proofErr w:type="spellEnd"/>
-            <w:r>
-              <w:rPr>
-                <w:b/>
-                <w:bCs/>
-              </w:rPr>
-              <w:t xml:space="preserve"> box detectado sobre la patente.</w:t>
-            </w:r>
-          </w:p>
-        </w:tc>
-        <w:tc>
-          <w:tcPr>
-            <w:tcW w:w="2551" w:type="dxa"/>
-          </w:tcPr>
-          <w:p>
-            <w:pPr>
-              <w:pStyle w:val="Piedepgina"/>
-              <w:jc w:val="both"/>
-              <w:rPr>
-                <w:rFonts w:ascii="Calibri" w:hAnsi="Calibri"/>
-                <w:b/>
-                <w:bCs/>
-              </w:rPr>
-            </w:pPr>
-            <w:r>
-              <w:rPr>
-                <w:b/>
-                <w:bCs/>
-              </w:rPr>
-              <w:t>Las métricas cuantifican objetivamente el desempeño del modelo de detección, mientras que las imágenes permiten verificar visualmente que efectivamente localiza patentes de forma correcta.</w:t>
-            </w:r>
-          </w:p>
-        </w:tc>
-      </w:tr>
-      <w:tr>
-        <w:trPr>
-          <w:trHeight w:val="362"/>
-        </w:trPr>
-        <w:tc>
-          <w:tcPr>
-            <w:tcW w:w="1843" w:type="dxa"/>
-          </w:tcPr>
-          <w:p>
-            <w:pPr>
-              <w:pStyle w:val="Piedepgina"/>
-              <w:jc w:val="both"/>
-              <w:rPr>
-                <w:rFonts w:ascii="Calibri" w:hAnsi="Calibri"/>
-                <w:b/>
-                <w:bCs/>
-              </w:rPr>
-            </w:pPr>
-            <w:r>
-              <w:rPr>
-                <w:b/>
-                <w:bCs/>
-              </w:rPr>
-              <w:t>Avance</w:t>
-            </w:r>
-          </w:p>
-        </w:tc>
-        <w:tc>
-          <w:tcPr>
-            <w:tcW w:w="1843" w:type="dxa"/>
-          </w:tcPr>
-          <w:p>
-            <w:pPr>
-              <w:pStyle w:val="Piedepgina"/>
-              <w:jc w:val="both"/>
-              <w:rPr>
-                <w:rFonts w:ascii="Calibri" w:hAnsi="Calibri"/>
-                <w:b/>
-                <w:bCs/>
-              </w:rPr>
-            </w:pPr>
-            <w:r>
-              <w:rPr>
-                <w:b/>
-                <w:bCs/>
-              </w:rPr>
-              <w:t>Módulo de OCR para lectura de caracteres</w:t>
-            </w:r>
-          </w:p>
-        </w:tc>
-        <w:tc>
-          <w:tcPr>
-            <w:tcW w:w="3825" w:type="dxa"/>
-          </w:tcPr>
-          <w:p>
-            <w:pPr>
-              <w:pStyle w:val="Piedepgina"/>
-              <w:jc w:val="both"/>
-              <w:rPr>
-                <w:rFonts w:ascii="Calibri" w:hAnsi="Calibri"/>
-                <w:b/>
-                <w:bCs/>
-              </w:rPr>
-            </w:pPr>
-            <w:r>
-              <w:rPr>
-                <w:b/>
-                <w:bCs/>
-              </w:rPr>
-              <w:t>Evidencia del proceso de extracción de texto a partir de la imagen recortada de la patente detectada, incluyendo ejemplos de entrada (imagen recortada) y salida (texto extraído) bajo distintas condiciones de iluminación y ángulo.</w:t>
-            </w:r>
-          </w:p>
-        </w:tc>
-        <w:tc>
-          <w:tcPr>
-            <w:tcW w:w="2551" w:type="dxa"/>
-          </w:tcPr>
-          <w:p>
-            <w:pPr>
-              <w:pStyle w:val="Piedepgina"/>
-              <w:jc w:val="both"/>
-              <w:rPr>
-                <w:rFonts w:ascii="Calibri" w:hAnsi="Calibri"/>
-                <w:b/>
-                <w:bCs/>
-              </w:rPr>
-            </w:pPr>
-            <w:r>
-              <w:rPr>
-                <w:b/>
-                <w:bCs/>
-              </w:rPr>
-              <w:t>Demuestra que el sistema es capaz de convertir la imagen de la patente detectada en texto legible, paso intermedio indispensable del pipeline.</w:t>
-            </w:r>
-          </w:p>
-        </w:tc>
-      </w:tr>
-      <w:tr>
-        <w:trPr>
-          <w:trHeight w:val="362"/>
-        </w:trPr>
-        <w:tc>
-          <w:tcPr>
-            <w:tcW w:w="1843" w:type="dxa"/>
-          </w:tcPr>
-          <w:p>
-            <w:pPr>
-              <w:pStyle w:val="Piedepgina"/>
-              <w:jc w:val="both"/>
-              <w:rPr>
-                <w:rFonts w:ascii="Calibri" w:hAnsi="Calibri"/>
-                <w:b/>
-                <w:bCs/>
-              </w:rPr>
-            </w:pPr>
-            <w:r>
-              <w:rPr>
-                <w:b/>
-                <w:bCs/>
-              </w:rPr>
-              <w:t>Avance</w:t>
-            </w:r>
-          </w:p>
-        </w:tc>
-        <w:tc>
-          <w:tcPr>
-            <w:tcW w:w="1843" w:type="dxa"/>
-          </w:tcPr>
-          <w:p>
-            <w:pPr>
-              <w:pStyle w:val="Piedepgina"/>
-              <w:jc w:val="both"/>
-              <w:rPr>
-                <w:rFonts w:ascii="Calibri" w:hAnsi="Calibri"/>
-                <w:b/>
-                <w:bCs/>
-              </w:rPr>
-            </w:pPr>
-            <w:r>
-              <w:rPr>
-                <w:b/>
-                <w:bCs/>
-              </w:rPr>
-              <w:t>Módulo de validación de formato (</w:t>
-            </w:r>
-            <w:proofErr w:type="spellStart"/>
-            <w:r>
-              <w:rPr>
-                <w:b/>
-                <w:bCs/>
-              </w:rPr>
-              <w:t>Regex</w:t>
-            </w:r>
-            <w:proofErr w:type="spellEnd"/>
-            <w:r>
-              <w:rPr>
-                <w:b/>
-                <w:bCs/>
-              </w:rPr>
-              <w:t>)</w:t>
-            </w:r>
-          </w:p>
-        </w:tc>
-        <w:tc>
-          <w:tcPr>
-            <w:tcW w:w="3825" w:type="dxa"/>
-          </w:tcPr>
-          <w:p>
-            <w:pPr>
-              <w:pStyle w:val="Piedepgina"/>
-              <w:jc w:val="both"/>
-              <w:rPr>
-                <w:rFonts w:ascii="Calibri" w:hAnsi="Calibri"/>
-                <w:b/>
-                <w:bCs/>
-              </w:rPr>
-            </w:pPr>
-            <w:r>
-              <w:rPr>
-                <w:b/>
-                <w:bCs/>
-              </w:rPr>
-              <w:t>Evidencia del proceso de validación del texto extraído por el OCR contra el patrón de formato de patente chilena, incluyendo ejemplos de textos válidos aceptados y textos mal leídos descartados o corregidos.</w:t>
-            </w:r>
-          </w:p>
-        </w:tc>
-        <w:tc>
-          <w:tcPr>
-            <w:tcW w:w="2551" w:type="dxa"/>
-          </w:tcPr>
-          <w:p>
-            <w:pPr>
-              <w:pStyle w:val="Piedepgina"/>
-              <w:jc w:val="both"/>
-              <w:rPr>
-                <w:rFonts w:ascii="Calibri" w:hAnsi="Calibri"/>
-                <w:b/>
-                <w:bCs/>
-              </w:rPr>
-            </w:pPr>
-            <w:r>
-              <w:rPr>
-                <w:b/>
-                <w:bCs/>
-              </w:rPr>
-              <w:t>Justifica que el sistema filtra lecturas erróneas del OCR, asegurando que solo se registren patentes con formato válido, lo que da confiabilidad al resultado final.</w:t>
-            </w:r>
-          </w:p>
-        </w:tc>
-      </w:tr>
-      <w:tr>
-        <w:trPr>
-          <w:trHeight w:val="362"/>
-        </w:trPr>
-        <w:tc>
-          <w:tcPr>
-            <w:tcW w:w="1843" w:type="dxa"/>
-          </w:tcPr>
-          <w:p>
-            <w:pPr>
-              <w:pStyle w:val="Piedepgina"/>
-              <w:jc w:val="both"/>
-              <w:rPr>
-                <w:rFonts w:ascii="Calibri" w:hAnsi="Calibri"/>
-                <w:b/>
-                <w:bCs/>
-              </w:rPr>
-            </w:pPr>
-            <w:r>
-              <w:rPr>
-                <w:b/>
-                <w:bCs/>
-              </w:rPr>
-              <w:t>Avance</w:t>
-            </w:r>
-          </w:p>
-        </w:tc>
-        <w:tc>
-          <w:tcPr>
-            <w:tcW w:w="1843" w:type="dxa"/>
-          </w:tcPr>
-          <w:p>
-            <w:pPr>
-              <w:pStyle w:val="Piedepgina"/>
-              <w:jc w:val="both"/>
-              <w:rPr>
-                <w:rFonts w:ascii="Calibri" w:hAnsi="Calibri"/>
-                <w:b/>
-                <w:bCs/>
-              </w:rPr>
-            </w:pPr>
-            <w:r>
-              <w:rPr>
-                <w:b/>
-                <w:bCs/>
-              </w:rPr>
-              <w:t>Aplicación web con autenticación y vistas por rol</w:t>
-            </w:r>
-          </w:p>
-        </w:tc>
-        <w:tc>
-          <w:tcPr>
-            <w:tcW w:w="3825" w:type="dxa"/>
-          </w:tcPr>
-          <w:p>
-            <w:pPr>
-              <w:pStyle w:val="Piedepgina"/>
-              <w:jc w:val="both"/>
-              <w:rPr>
-                <w:rFonts w:ascii="Calibri" w:hAnsi="Calibri"/>
-                <w:b/>
-                <w:bCs/>
-              </w:rPr>
-            </w:pPr>
-            <w:r>
-              <w:rPr>
-                <w:b/>
-                <w:bCs/>
-              </w:rPr>
-              <w:t>Sistema funcional con login y vistas diferenciadas para Administrador, Propietario y Guardia.</w:t>
-            </w:r>
-          </w:p>
-        </w:tc>
-        <w:tc>
-          <w:tcPr>
-            <w:tcW w:w="2551" w:type="dxa"/>
-          </w:tcPr>
-          <w:p>
-            <w:pPr>
-              <w:pStyle w:val="Piedepgina"/>
-              <w:jc w:val="both"/>
-              <w:rPr>
-                <w:rFonts w:ascii="Calibri" w:hAnsi="Calibri"/>
-                <w:b/>
-                <w:bCs/>
-              </w:rPr>
-            </w:pPr>
-            <w:r>
-              <w:rPr>
-                <w:b/>
-                <w:bCs/>
-              </w:rPr>
-              <w:t>Evidencia el desarrollo paralelo de la plataforma web, permitiendo verificar que la estructura de roles definida en el diseño se implementó correctamente.</w:t>
-            </w:r>
-          </w:p>
-        </w:tc>
-      </w:tr>
-      <w:tr>
-        <w:trPr>
-          <w:trHeight w:val="362"/>
-        </w:trPr>
-        <w:tc>
-          <w:tcPr>
-            <w:tcW w:w="1843" w:type="dxa"/>
-          </w:tcPr>
-          <w:p>
-            <w:pPr>
-              <w:pStyle w:val="Piedepgina"/>
-              <w:jc w:val="both"/>
-              <w:rPr>
-                <w:rFonts w:ascii="Calibri" w:hAnsi="Calibri"/>
-                <w:b/>
-                <w:bCs/>
-              </w:rPr>
-            </w:pPr>
-            <w:r>
-              <w:rPr>
-                <w:b/>
-                <w:bCs/>
-              </w:rPr>
-              <w:t>Avance</w:t>
-            </w:r>
-          </w:p>
-        </w:tc>
-        <w:tc>
-          <w:tcPr>
-            <w:tcW w:w="1843" w:type="dxa"/>
-          </w:tcPr>
-          <w:p>
-            <w:pPr>
-              <w:pStyle w:val="Piedepgina"/>
-              <w:jc w:val="both"/>
-              <w:rPr>
-                <w:rFonts w:ascii="Calibri" w:hAnsi="Calibri"/>
-                <w:b/>
-                <w:bCs/>
-              </w:rPr>
-            </w:pPr>
-            <w:r>
-              <w:rPr>
-                <w:b/>
-                <w:bCs/>
-              </w:rPr>
-              <w:t xml:space="preserve">Registro de </w:t>
-            </w:r>
-            <w:proofErr w:type="spellStart"/>
-            <w:r>
-              <w:rPr>
-                <w:b/>
-                <w:bCs/>
-              </w:rPr>
-              <w:t>commits</w:t>
-            </w:r>
-            <w:proofErr w:type="spellEnd"/>
-            <w:r>
-              <w:rPr>
-                <w:b/>
-                <w:bCs/>
-              </w:rPr>
-              <w:t xml:space="preserve"> en GitHub</w:t>
-            </w:r>
-          </w:p>
-        </w:tc>
-        <w:tc>
-          <w:tcPr>
-            <w:tcW w:w="3825" w:type="dxa"/>
-          </w:tcPr>
-          <w:p>
-            <w:pPr>
-              <w:pStyle w:val="Piedepgina"/>
-              <w:jc w:val="both"/>
-              <w:rPr>
-                <w:rFonts w:ascii="Calibri" w:hAnsi="Calibri"/>
-                <w:b/>
-                <w:bCs/>
-              </w:rPr>
-            </w:pPr>
-            <w:r>
-              <w:rPr>
-                <w:b/>
-                <w:bCs/>
-              </w:rPr>
-              <w:t xml:space="preserve">Historial de </w:t>
-            </w:r>
-            <w:proofErr w:type="spellStart"/>
-            <w:r>
-              <w:rPr>
-                <w:b/>
-                <w:bCs/>
-              </w:rPr>
-              <w:t>commits</w:t>
-            </w:r>
-            <w:proofErr w:type="spellEnd"/>
-            <w:r>
-              <w:rPr>
-                <w:b/>
-                <w:bCs/>
-              </w:rPr>
-              <w:t xml:space="preserve"> del repositorio público del proyecto, diferenciado por integrante.</w:t>
-            </w:r>
-          </w:p>
-        </w:tc>
-        <w:tc>
-          <w:tcPr>
-            <w:tcW w:w="2551" w:type="dxa"/>
-          </w:tcPr>
-          <w:p>
-            <w:pPr>
-              <w:pStyle w:val="Piedepgina"/>
-              <w:jc w:val="both"/>
-              <w:rPr>
-                <w:rFonts w:ascii="Calibri" w:hAnsi="Calibri"/>
-                <w:b/>
-                <w:bCs/>
-              </w:rPr>
-            </w:pPr>
-            <w:r>
-              <w:rPr>
-                <w:b/>
-                <w:bCs/>
-              </w:rPr>
-              <w:t>Permite verificar el trabajo continuo y la contribución individual de cada integrante durante el desarrollo.</w:t>
-            </w:r>
-          </w:p>
-        </w:tc>
-      </w:tr>
-      <w:tr>
-        <w:trPr>
-          <w:trHeight w:val="362"/>
-        </w:trPr>
-        <w:tc>
-          <w:tcPr>
-            <w:tcW w:w="1843" w:type="dxa"/>
-          </w:tcPr>
-          <w:p>
-            <w:pPr>
-              <w:pStyle w:val="Piedepgina"/>
-              <w:jc w:val="both"/>
-              <w:rPr>
-                <w:rFonts w:ascii="Calibri" w:hAnsi="Calibri"/>
-                <w:b/>
-                <w:bCs/>
-              </w:rPr>
-            </w:pPr>
-            <w:r>
-              <w:rPr>
-                <w:b/>
-                <w:bCs/>
-              </w:rPr>
               <w:lastRenderedPageBreak/>
-              <w:t>Final</w:t>
-            </w:r>
-          </w:p>
-        </w:tc>
-        <w:tc>
-          <w:tcPr>
-            <w:tcW w:w="1843" w:type="dxa"/>
-          </w:tcPr>
-          <w:p>
-            <w:pPr>
-              <w:pStyle w:val="Piedepgina"/>
-              <w:jc w:val="both"/>
-              <w:rPr>
-                <w:rFonts w:ascii="Calibri" w:hAnsi="Calibri"/>
-                <w:b/>
-                <w:bCs/>
-              </w:rPr>
-            </w:pPr>
-            <w:r>
-              <w:rPr>
-                <w:b/>
-                <w:bCs/>
-              </w:rPr>
-              <w:t>Sistema integrado funcionando end-to-end</w:t>
-            </w:r>
-          </w:p>
-        </w:tc>
-        <w:tc>
-          <w:tcPr>
-            <w:tcW w:w="3825" w:type="dxa"/>
-          </w:tcPr>
-          <w:p>
-            <w:pPr>
-              <w:pStyle w:val="Piedepgina"/>
-              <w:jc w:val="both"/>
-              <w:rPr>
-                <w:rFonts w:ascii="Calibri" w:hAnsi="Calibri"/>
-                <w:b/>
-                <w:bCs/>
-              </w:rPr>
-            </w:pPr>
-            <w:r>
-              <w:rPr>
-                <w:b/>
-                <w:bCs/>
-              </w:rPr>
-              <w:t>Sistema completo: cámara capturando video, detección y OCR de patentes, validación contra base de datos, y alertas en la interfaz del Guardia.</w:t>
-            </w:r>
-          </w:p>
-        </w:tc>
-        <w:tc>
-          <w:tcPr>
-            <w:tcW w:w="2551" w:type="dxa"/>
-          </w:tcPr>
-          <w:p>
-            <w:pPr>
-              <w:pStyle w:val="Piedepgina"/>
-              <w:jc w:val="both"/>
-              <w:rPr>
-                <w:rFonts w:ascii="Calibri" w:hAnsi="Calibri"/>
-                <w:b/>
-                <w:bCs/>
-              </w:rPr>
-            </w:pPr>
-            <w:r>
-              <w:rPr>
-                <w:b/>
-                <w:bCs/>
-              </w:rPr>
-              <w:t>Es la evidencia principal que demuestra el cumplimiento del objetivo general del proyecto.</w:t>
-            </w:r>
-          </w:p>
-        </w:tc>
-      </w:tr>
-      <w:tr>
-        <w:trPr>
-          <w:trHeight w:val="362"/>
-        </w:trPr>
-        <w:tc>
-          <w:tcPr>
-            <w:tcW w:w="1843" w:type="dxa"/>
-          </w:tcPr>
-          <w:p>
-            <w:pPr>
-              <w:pStyle w:val="Piedepgina"/>
-              <w:jc w:val="both"/>
-              <w:rPr>
-                <w:rFonts w:ascii="Calibri" w:hAnsi="Calibri"/>
-                <w:b/>
-                <w:bCs/>
-              </w:rPr>
-            </w:pPr>
-            <w:r>
-              <w:rPr>
-                <w:b/>
-                <w:bCs/>
-              </w:rPr>
-              <w:t>Final</w:t>
-            </w:r>
-          </w:p>
-        </w:tc>
-        <w:tc>
-          <w:tcPr>
-            <w:tcW w:w="1843" w:type="dxa"/>
-          </w:tcPr>
-          <w:p>
-            <w:pPr>
-              <w:pStyle w:val="Piedepgina"/>
-              <w:jc w:val="both"/>
-              <w:rPr>
-                <w:rFonts w:ascii="Calibri" w:hAnsi="Calibri"/>
-                <w:b/>
-                <w:bCs/>
-              </w:rPr>
-            </w:pPr>
-            <w:r>
-              <w:rPr>
-                <w:b/>
-                <w:bCs/>
-              </w:rPr>
-              <w:t>Resultados de pruebas en terreno</w:t>
-            </w:r>
-          </w:p>
-        </w:tc>
-        <w:tc>
-          <w:tcPr>
-            <w:tcW w:w="3825" w:type="dxa"/>
-          </w:tcPr>
-          <w:p>
-            <w:pPr>
-              <w:pStyle w:val="Piedepgina"/>
-              <w:jc w:val="both"/>
-              <w:rPr>
-                <w:rFonts w:ascii="Calibri" w:hAnsi="Calibri"/>
-                <w:b/>
-                <w:bCs/>
-              </w:rPr>
-            </w:pPr>
-            <w:r>
-              <w:rPr>
-                <w:b/>
-                <w:bCs/>
-              </w:rPr>
-              <w:t>Registro de pruebas realizadas con los vehículos autorizados para calibración (aciertos, errores, condiciones de prueba).</w:t>
-            </w:r>
-          </w:p>
-        </w:tc>
-        <w:tc>
-          <w:tcPr>
-            <w:tcW w:w="2551" w:type="dxa"/>
-          </w:tcPr>
-          <w:p>
-            <w:pPr>
-              <w:pStyle w:val="Piedepgina"/>
-              <w:jc w:val="both"/>
-              <w:rPr>
-                <w:rFonts w:ascii="Calibri" w:hAnsi="Calibri"/>
-                <w:b/>
-                <w:bCs/>
-              </w:rPr>
-            </w:pPr>
-            <w:r>
-              <w:rPr>
-                <w:b/>
-                <w:bCs/>
-              </w:rPr>
-              <w:t>Justifica la validación real del sistema fuera de un entorno controlado, dando cuenta de su funcionamiento efectivo.</w:t>
-            </w:r>
-          </w:p>
-        </w:tc>
-      </w:tr>
-    </w:tbl>
-    <w:p>
-      <w:pPr>
-        <w:spacing w:after="0" w:line="240" w:lineRule="auto"/>
-        <w:jc w:val="both"/>
-        <w:rPr>
-          <w:b/>
-          <w:sz w:val="24"/>
-          <w:szCs w:val="24"/>
-        </w:rPr>
-      </w:pPr>
-    </w:p>
-    <w:p>
-      <w:pPr>
-        <w:spacing w:after="0" w:line="240" w:lineRule="auto"/>
-        <w:jc w:val="both"/>
-        <w:rPr>
-          <w:b/>
-          <w:sz w:val="24"/>
-          <w:szCs w:val="24"/>
-        </w:rPr>
-      </w:pPr>
-    </w:p>
-    <w:p>
-      <w:pPr>
-        <w:spacing w:after="0" w:line="240" w:lineRule="auto"/>
-        <w:jc w:val="both"/>
-        <w:rPr>
-          <w:b/>
-          <w:sz w:val="24"/>
-          <w:szCs w:val="24"/>
-        </w:rPr>
-      </w:pPr>
-    </w:p>
-    <w:p>
-      <w:pPr>
-        <w:spacing w:after="0" w:line="240" w:lineRule="auto"/>
-        <w:jc w:val="both"/>
-        <w:rPr>
-          <w:b/>
-          <w:sz w:val="24"/>
-          <w:szCs w:val="24"/>
-        </w:rPr>
-      </w:pPr>
-    </w:p>
-    <w:p>
-      <w:pPr>
-        <w:spacing w:after="0" w:line="240" w:lineRule="auto"/>
-        <w:jc w:val="both"/>
-        <w:rPr>
-          <w:b/>
-          <w:sz w:val="24"/>
-          <w:szCs w:val="24"/>
-        </w:rPr>
-      </w:pPr>
-    </w:p>
-    <w:p>
-      <w:pPr>
-        <w:spacing w:after="0" w:line="240" w:lineRule="auto"/>
-        <w:jc w:val="both"/>
-        <w:rPr>
-          <w:b/>
-          <w:sz w:val="24"/>
-          <w:szCs w:val="24"/>
-        </w:rPr>
-      </w:pPr>
-    </w:p>
-    <w:p>
-      <w:pPr>
-        <w:spacing w:after="0" w:line="240" w:lineRule="auto"/>
-        <w:jc w:val="both"/>
-        <w:rPr>
-          <w:b/>
-          <w:sz w:val="24"/>
-          <w:szCs w:val="24"/>
-        </w:rPr>
-      </w:pPr>
-    </w:p>
-    <w:p>
-      <w:pPr>
-        <w:spacing w:after="0" w:line="240" w:lineRule="auto"/>
-        <w:jc w:val="both"/>
-        <w:rPr>
-          <w:b/>
-          <w:sz w:val="24"/>
-          <w:szCs w:val="24"/>
-        </w:rPr>
-      </w:pPr>
-    </w:p>
-    <w:p>
-      <w:pPr>
-        <w:spacing w:after="0" w:line="240" w:lineRule="auto"/>
-        <w:jc w:val="both"/>
-        <w:rPr>
-          <w:b/>
-          <w:sz w:val="24"/>
-          <w:szCs w:val="24"/>
-        </w:rPr>
-      </w:pPr>
-    </w:p>
-    <w:p>
-      <w:pPr>
-        <w:spacing w:after="0" w:line="240" w:lineRule="auto"/>
-        <w:jc w:val="both"/>
-        <w:rPr>
-          <w:b/>
-          <w:sz w:val="24"/>
-          <w:szCs w:val="24"/>
-        </w:rPr>
-      </w:pPr>
-    </w:p>
-    <w:p>
-      <w:pPr>
-        <w:spacing w:after="0" w:line="240" w:lineRule="auto"/>
-        <w:jc w:val="both"/>
-        <w:rPr>
-          <w:b/>
-          <w:sz w:val="24"/>
-          <w:szCs w:val="24"/>
-        </w:rPr>
-      </w:pPr>
-    </w:p>
-    <w:tbl>
-      <w:tblPr>
-        <w:tblStyle w:val="Tablaconcuadrcula"/>
-        <w:tblW w:w="9640" w:type="dxa"/>
-        <w:tblInd w:w="-714" w:type="dxa"/>
-        <w:tblBorders>
-          <w:top w:val="single" w:sz="4" w:space="0" w:color="BFBFBF" w:themeColor="background1" w:themeShade="BF"/>
-          <w:left w:val="single" w:sz="4" w:space="0" w:color="BFBFBF" w:themeColor="background1" w:themeShade="BF"/>
-          <w:bottom w:val="single" w:sz="4" w:space="0" w:color="BFBFBF" w:themeColor="background1" w:themeShade="BF"/>
-          <w:right w:val="single" w:sz="4" w:space="0" w:color="BFBFBF" w:themeColor="background1" w:themeShade="BF"/>
-          <w:insideH w:val="single" w:sz="4" w:space="0" w:color="BFBFBF" w:themeColor="background1" w:themeShade="BF"/>
-          <w:insideV w:val="single" w:sz="4" w:space="0" w:color="BFBFBF" w:themeColor="background1" w:themeShade="BF"/>
-        </w:tblBorders>
-        <w:tblLook w:val="04A0" w:firstRow="1" w:lastRow="0" w:firstColumn="1" w:lastColumn="0" w:noHBand="0" w:noVBand="1"/>
-      </w:tblPr>
-      <w:tblGrid>
-        <w:gridCol w:w="9640"/>
-      </w:tblGrid>
-      <w:tr>
-        <w:trPr>
-          <w:trHeight w:val="440"/>
-        </w:trPr>
-        <w:tc>
-          <w:tcPr>
-            <w:tcW w:w="9640" w:type="dxa"/>
-            <w:vAlign w:val="center"/>
-          </w:tcPr>
-          <w:p>
-            <w:pPr>
-              <w:spacing w:line="240" w:lineRule="auto"/>
-              <w:jc w:val="both"/>
-              <w:rPr>
-                <w:b/>
-                <w:color w:val="1F3864" w:themeColor="accent1" w:themeShade="80"/>
-                <w:sz w:val="28"/>
-                <w:szCs w:val="28"/>
-              </w:rPr>
-            </w:pPr>
-            <w:r>
-              <w:rPr>
-                <w:b/>
-                <w:color w:val="1F3864" w:themeColor="accent1" w:themeShade="80"/>
-                <w:sz w:val="28"/>
-                <w:szCs w:val="28"/>
-              </w:rPr>
               <w:t>7</w:t>
             </w:r>
             <w:r>
@@ -5647,14 +5233,7 @@
               <w:rPr>
                 <w:b/>
               </w:rPr>
-              <w:t xml:space="preserve">Ofrecer propuestas de solución informática </w:t>
-            </w:r>
-            <w:r>
-              <w:rPr>
-                <w:b/>
-              </w:rPr>
-              <w:lastRenderedPageBreak/>
-              <w:t>analizando de forma integral los procesos de acuerdo a los requerimientos de la organización.</w:t>
+              <w:t>Ofrecer propuestas de solución informática analizando de forma integral los procesos de acuerdo a los requerimientos de la organización.</w:t>
             </w:r>
           </w:p>
         </w:tc>
@@ -5671,15 +5250,7 @@
               <w:rPr>
                 <w:b/>
               </w:rPr>
-              <w:lastRenderedPageBreak/>
-              <w:t xml:space="preserve">Análisis y definición del </w:t>
-            </w:r>
-            <w:r>
-              <w:rPr>
-                <w:b/>
-              </w:rPr>
-              <w:lastRenderedPageBreak/>
-              <w:t>proyecto APT (Semana 1)</w:t>
+              <w:t>Análisis y definición del proyecto APT (Semana 1)</w:t>
             </w:r>
           </w:p>
         </w:tc>
@@ -5696,15 +5267,7 @@
               <w:rPr>
                 <w:b/>
               </w:rPr>
-              <w:lastRenderedPageBreak/>
-              <w:t xml:space="preserve">Análisis de las alternativas de proyecto y selección </w:t>
-            </w:r>
-            <w:r>
-              <w:rPr>
-                <w:b/>
-              </w:rPr>
-              <w:lastRenderedPageBreak/>
-              <w:t>definitiva de la propuesta SegurIA-LPR, de acuerdo al perfil de egreso.</w:t>
+              <w:t>Análisis de las alternativas de proyecto y selección definitiva de la propuesta SegurIA-LPR, de acuerdo al perfil de egreso.</w:t>
             </w:r>
           </w:p>
         </w:tc>
@@ -5721,15 +5284,7 @@
               <w:rPr>
                 <w:b/>
               </w:rPr>
-              <w:lastRenderedPageBreak/>
-              <w:t xml:space="preserve">Guía del Estudiante Fase 1, </w:t>
-            </w:r>
-            <w:r>
-              <w:rPr>
-                <w:b/>
-              </w:rPr>
-              <w:lastRenderedPageBreak/>
-              <w:t>reuniones de equipo.</w:t>
+              <w:t>Guía del Estudiante Fase 1, reuniones de equipo.</w:t>
             </w:r>
           </w:p>
         </w:tc>
@@ -5746,7 +5301,6 @@
               <w:rPr>
                 <w:b/>
               </w:rPr>
-              <w:lastRenderedPageBreak/>
               <w:t>1 semana (S1)</w:t>
             </w:r>
           </w:p>
@@ -5781,14 +5335,7 @@
               <w:rPr>
                 <w:b/>
               </w:rPr>
-              <w:t xml:space="preserve">Corresponde a la primera semana de la Fase 1, </w:t>
-            </w:r>
-            <w:r>
-              <w:rPr>
-                <w:b/>
-              </w:rPr>
-              <w:lastRenderedPageBreak/>
-              <w:t>dedicada a definir claramente el proyecto a desarrollar.</w:t>
+              <w:t>Corresponde a la primera semana de la Fase 1, dedicada a definir claramente el proyecto a desarrollar.</w:t>
             </w:r>
           </w:p>
         </w:tc>
@@ -5810,7 +5357,14 @@
               <w:rPr>
                 <w:b/>
               </w:rPr>
-              <w:t>Construir el modelo arquitectónico de una solución sistémica que soporte los procesos de negocio de acuerdo a los requerimientos de la organización y estándares de la industria.</w:t>
+              <w:t xml:space="preserve">Construir el modelo arquitectónico de una solución sistémica que soporte los procesos de negocio de acuerdo a los requerimientos de la organización y </w:t>
+            </w:r>
+            <w:r>
+              <w:rPr>
+                <w:b/>
+              </w:rPr>
+              <w:lastRenderedPageBreak/>
+              <w:t>estándares de la industria.</w:t>
             </w:r>
           </w:p>
         </w:tc>
@@ -5827,6 +5381,7 @@
               <w:rPr>
                 <w:b/>
               </w:rPr>
+              <w:lastRenderedPageBreak/>
               <w:t>Desarrollo de la idea de proyecto y definición de tecnologías (Semana 2)</w:t>
             </w:r>
           </w:p>
@@ -5844,21 +5399,26 @@
               <w:rPr>
                 <w:b/>
               </w:rPr>
-              <w:t xml:space="preserve">Asesoría docente para identificar mejoras al proyecto en relación al perfil de egreso y definición de las tecnologías a utilizar durante el desarrollo (YOLOv8, OCR, </w:t>
-            </w:r>
-            <w:proofErr w:type="spellStart"/>
-            <w:r>
-              <w:rPr>
-                <w:b/>
-              </w:rPr>
-              <w:t>framework</w:t>
-            </w:r>
-            <w:proofErr w:type="spellEnd"/>
-            <w:r>
-              <w:rPr>
-                <w:b/>
-              </w:rPr>
-              <w:t xml:space="preserve"> web, cámara IP).</w:t>
+              <w:t>Asesoría docente para identificar mejoras al proyecto en relación al perfil de egreso y definición de las tecnologías a utilizar durante el desarrollo (</w:t>
+            </w:r>
+            <w:r>
+              <w:rPr>
+                <w:b/>
+              </w:rPr>
+              <w:t>TP-</w:t>
+            </w:r>
+            <w:r>
+              <w:rPr>
+                <w:b/>
+              </w:rPr>
+              <w:lastRenderedPageBreak/>
+              <w:t>Link Tapi C310, Raspberry PI 4 4GB</w:t>
+            </w:r>
+            <w:r>
+              <w:rPr>
+                <w:b/>
+              </w:rPr>
+              <w:t>).</w:t>
             </w:r>
           </w:p>
         </w:tc>
@@ -5875,35 +5435,38 @@
               <w:rPr>
                 <w:b/>
               </w:rPr>
-              <w:t xml:space="preserve">Asesoría del docente, documentación de tecnologías (YOLOv8, </w:t>
-            </w:r>
-            <w:proofErr w:type="spellStart"/>
-            <w:r>
-              <w:rPr>
-                <w:b/>
-              </w:rPr>
-              <w:t>Tesseract</w:t>
-            </w:r>
-            <w:proofErr w:type="spellEnd"/>
-            <w:r>
-              <w:rPr>
-                <w:b/>
-              </w:rPr>
-              <w:t>/</w:t>
-            </w:r>
-            <w:proofErr w:type="spellStart"/>
-            <w:r>
-              <w:rPr>
-                <w:b/>
-              </w:rPr>
-              <w:t>EasyOCR</w:t>
-            </w:r>
-            <w:proofErr w:type="spellEnd"/>
-            <w:r>
-              <w:rPr>
-                <w:b/>
-              </w:rPr>
-              <w:t>, TP-Link Tapo C310).</w:t>
+              <w:lastRenderedPageBreak/>
+              <w:t>Asesoría del docente, documentación de tecnologías (TP-Link Tapo C310</w:t>
+            </w:r>
+            <w:r>
+              <w:rPr>
+                <w:b/>
+              </w:rPr>
+              <w:t>,</w:t>
+            </w:r>
+            <w:r>
+              <w:rPr>
+                <w:b/>
+              </w:rPr>
+              <w:t xml:space="preserve"> Raspberry</w:t>
+            </w:r>
+            <w:r>
+              <w:rPr>
+                <w:b/>
+              </w:rPr>
+              <w:t xml:space="preserve"> PI 4 4</w:t>
+            </w:r>
+            <w:r>
+              <w:rPr>
+                <w:b/>
+              </w:rPr>
+              <w:t>GB</w:t>
+            </w:r>
+            <w:r>
+              <w:rPr>
+                <w:b/>
+              </w:rPr>
+              <w:t>).</w:t>
             </w:r>
           </w:p>
         </w:tc>
@@ -5976,6 +5539,7 @@
               <w:rPr>
                 <w:b/>
               </w:rPr>
+              <w:lastRenderedPageBreak/>
               <w:t>Gestionar proyectos informáticos, ofreciendo alternativas para la toma de decisiones de acuerdo a los requerimientos de la organización.</w:t>
             </w:r>
           </w:p>
@@ -6100,14 +5664,7 @@
               <w:rPr>
                 <w:b/>
               </w:rPr>
-              <w:t>Gestionar proyectos informáticos, ofreciendo alternativas para la toma de decisiones de acuerdo a los requerimiento</w:t>
-            </w:r>
-            <w:r>
-              <w:rPr>
-                <w:b/>
-              </w:rPr>
-              <w:lastRenderedPageBreak/>
-              <w:t>s de la organización.</w:t>
+              <w:t>Gestionar proyectos informáticos, ofreciendo alternativas para la toma de decisiones de acuerdo a los requerimientos de la organización.</w:t>
             </w:r>
           </w:p>
         </w:tc>
@@ -6124,7 +5681,6 @@
               <w:rPr>
                 <w:b/>
               </w:rPr>
-              <w:lastRenderedPageBreak/>
               <w:t>Preparación y presentación del proyecto APT (Semana 4)</w:t>
             </w:r>
           </w:p>
@@ -6363,7 +5919,14 @@
               <w:rPr>
                 <w:b/>
               </w:rPr>
-              <w:t>Construir Modelos de datos para soportar los requerimientos de la organización de acuerdo a un diseño definido y escalable en el tiempo.</w:t>
+              <w:t xml:space="preserve">Construir Modelos de datos para soportar los requerimientos de la organización de acuerdo a un diseño </w:t>
+            </w:r>
+            <w:r>
+              <w:rPr>
+                <w:b/>
+              </w:rPr>
+              <w:lastRenderedPageBreak/>
+              <w:t>definido y escalable en el tiempo.</w:t>
             </w:r>
           </w:p>
         </w:tc>
@@ -6380,6 +5943,7 @@
               <w:rPr>
                 <w:b/>
               </w:rPr>
+              <w:lastRenderedPageBreak/>
               <w:t>Modelo de datos y estructura base del proyecto web (Sprint 0)</w:t>
             </w:r>
           </w:p>
@@ -6397,7 +5961,14 @@
               <w:rPr>
                 <w:b/>
               </w:rPr>
-              <w:t>Creación del modelo de datos del sistema y de la estructura base del proyecto web (</w:t>
+              <w:t xml:space="preserve">Creación del modelo de datos del sistema y de la estructura base del proyecto web </w:t>
+            </w:r>
+            <w:r>
+              <w:rPr>
+                <w:b/>
+              </w:rPr>
+              <w:lastRenderedPageBreak/>
+              <w:t>(</w:t>
             </w:r>
             <w:proofErr w:type="spellStart"/>
             <w:r>
@@ -6442,6 +6013,7 @@
               <w:rPr>
                 <w:b/>
               </w:rPr>
+              <w:lastRenderedPageBreak/>
               <w:t xml:space="preserve">Motor de base de datos, </w:t>
             </w:r>
             <w:proofErr w:type="spellStart"/>
@@ -6514,7 +6086,14 @@
               <w:rPr>
                 <w:b/>
               </w:rPr>
-              <w:t>El modelo de datos debe quedar definido tempranamente para permitir el desarrollo paralelo del resto del sistema.</w:t>
+              <w:t xml:space="preserve">El modelo de datos debe quedar definido tempranamente para permitir el desarrollo paralelo del </w:t>
+            </w:r>
+            <w:r>
+              <w:rPr>
+                <w:b/>
+              </w:rPr>
+              <w:lastRenderedPageBreak/>
+              <w:t>resto del sistema.</w:t>
             </w:r>
           </w:p>
         </w:tc>
@@ -6536,6 +6115,7 @@
               <w:rPr>
                 <w:b/>
               </w:rPr>
+              <w:lastRenderedPageBreak/>
               <w:t>Desarrollar una solución de software utilizando técnicas que permitan sistematizar el proceso de desarrollo y mantenimiento, asegurando el logro de los objetivos.</w:t>
             </w:r>
           </w:p>
@@ -6615,7 +6195,39 @@
               <w:rPr>
                 <w:b/>
               </w:rPr>
-              <w:t>YOLOv8, computador de Erick, dataset etiquetado.</w:t>
+              <w:t xml:space="preserve">YOLOv8, </w:t>
+            </w:r>
+            <w:r>
+              <w:rPr>
+                <w:b/>
+              </w:rPr>
+              <w:t>Rasp</w:t>
+            </w:r>
+            <w:r>
+              <w:rPr>
+                <w:b/>
+              </w:rPr>
+              <w:t>berry PI 4 4GB</w:t>
+            </w:r>
+            <w:r>
+              <w:rPr>
+                <w:b/>
+              </w:rPr>
+              <w:t xml:space="preserve">, </w:t>
+            </w:r>
+            <w:proofErr w:type="spellStart"/>
+            <w:r>
+              <w:rPr>
+                <w:b/>
+              </w:rPr>
+              <w:t>dataset</w:t>
+            </w:r>
+            <w:proofErr w:type="spellEnd"/>
+            <w:r>
+              <w:rPr>
+                <w:b/>
+              </w:rPr>
+              <w:t xml:space="preserve"> etiquetado.</w:t>
             </w:r>
           </w:p>
         </w:tc>
@@ -6716,14 +6328,7 @@
               <w:rPr>
                 <w:b/>
               </w:rPr>
-              <w:t xml:space="preserve">Construir programas y rutinas de variada complejidad para dar solución a requerimientos de la </w:t>
-            </w:r>
-            <w:r>
-              <w:rPr>
-                <w:b/>
-              </w:rPr>
-              <w:lastRenderedPageBreak/>
-              <w:t>organización, acordes a tecnologías de mercado y utilizando buenas prácticas de codificación.</w:t>
+              <w:t>Construir programas y rutinas de variada complejidad para dar solución a requerimientos de la organización, acordes a tecnologías de mercado y utilizando buenas prácticas de codificación.</w:t>
             </w:r>
           </w:p>
         </w:tc>
@@ -6740,7 +6345,6 @@
               <w:rPr>
                 <w:b/>
               </w:rPr>
-              <w:lastRenderedPageBreak/>
               <w:t>Autenticación y vistas base por rol (Sprint 1)</w:t>
             </w:r>
           </w:p>
@@ -6758,14 +6362,7 @@
               <w:rPr>
                 <w:b/>
               </w:rPr>
-              <w:t>Implementación del sistema de autenticación y de las vistas base diferenciadas por rol (Administrado</w:t>
-            </w:r>
-            <w:r>
-              <w:rPr>
-                <w:b/>
-              </w:rPr>
-              <w:lastRenderedPageBreak/>
-              <w:t>r, Propietario, Guardia).</w:t>
+              <w:t>Implementación del sistema de autenticación y de las vistas base diferenciadas por rol (Administrador, Propietario, Guardia).</w:t>
             </w:r>
           </w:p>
         </w:tc>
@@ -6782,7 +6379,6 @@
               <w:rPr>
                 <w:b/>
               </w:rPr>
-              <w:lastRenderedPageBreak/>
               <w:t>Framework web, librería de autenticación, repositorio GitHub.</w:t>
             </w:r>
           </w:p>
@@ -6856,7 +6452,14 @@
               <w:rPr>
                 <w:b/>
               </w:rPr>
-              <w:t>Construir programas y rutinas de variada complejidad para dar solución a requerimientos de la organización, acordes a tecnologías de mercado y utilizando buenas prácticas de codificación.</w:t>
+              <w:t xml:space="preserve">Construir programas y rutinas de variada complejidad para dar solución a requerimientos de la organización, acordes a tecnologías de mercado y utilizando buenas </w:t>
+            </w:r>
+            <w:r>
+              <w:rPr>
+                <w:b/>
+              </w:rPr>
+              <w:lastRenderedPageBreak/>
+              <w:t>prácticas de codificación.</w:t>
             </w:r>
           </w:p>
         </w:tc>
@@ -6873,6 +6476,7 @@
               <w:rPr>
                 <w:b/>
               </w:rPr>
+              <w:lastRenderedPageBreak/>
               <w:t>Integración de OCR y validación de formato (Sprint 2)</w:t>
             </w:r>
           </w:p>
@@ -7002,6 +6606,7 @@
               <w:rPr>
                 <w:b/>
               </w:rPr>
+              <w:lastRenderedPageBreak/>
               <w:t>Programar consultas o rutinas para manipular información de una base de datos de acuerdo a los requerimientos de la organización.</w:t>
             </w:r>
           </w:p>
@@ -7126,14 +6731,7 @@
               <w:rPr>
                 <w:b/>
               </w:rPr>
-              <w:t xml:space="preserve">Construir el modelo arquitectónico de una solución sistémica que soporte los procesos de negocio de acuerdo a los requerimientos de la </w:t>
-            </w:r>
-            <w:r>
-              <w:rPr>
-                <w:b/>
-              </w:rPr>
-              <w:lastRenderedPageBreak/>
-              <w:t>organización y estándares de la industria.</w:t>
+              <w:t>Construir el modelo arquitectónico de una solución sistémica que soporte los procesos de negocio de acuerdo a los requerimientos de la organización y estándares de la industria.</w:t>
             </w:r>
           </w:p>
         </w:tc>
@@ -7150,8 +6748,19 @@
               <w:rPr>
                 <w:b/>
               </w:rPr>
-              <w:lastRenderedPageBreak/>
-              <w:t>Integración de cámara IP RTSP/ONVIF (Sprint 3)</w:t>
+              <w:t>Integración Tapo C310 + Raspberry Pi (S</w:t>
+            </w:r>
+            <w:r>
+              <w:rPr>
+                <w:b/>
+              </w:rPr>
+              <w:t>print 2</w:t>
+            </w:r>
+            <w:r>
+              <w:rPr>
+                <w:b/>
+              </w:rPr>
+              <w:t>)</w:t>
             </w:r>
           </w:p>
         </w:tc>
@@ -7168,7 +6777,7 @@
               <w:rPr>
                 <w:b/>
               </w:rPr>
-              <w:t>Integración de la cámara IP (TP-Link Tapo C310) al sistema de procesamiento mediante protocolo RTSP/ONVIF.</w:t>
+              <w:t>Configurar la cámara, establecer el flujo RTSP/ONVIF y ejecutar la captura/procesamiento en Raspberry Pi.</w:t>
             </w:r>
           </w:p>
         </w:tc>
@@ -7185,7 +6794,13 @@
               <w:rPr>
                 <w:b/>
               </w:rPr>
-              <w:t>Cámara IP TP-Link Tapo C310 (RTSP/ONVIF), librería de procesamiento de video.</w:t>
+              <w:t>Tapo C310, Raspberry Pi 4 4 GB, red local</w:t>
+            </w:r>
+            <w:r>
+              <w:rPr>
+                <w:b/>
+              </w:rPr>
+              <w:t>.</w:t>
             </w:r>
           </w:p>
         </w:tc>
@@ -7418,7 +7033,14 @@
               <w:rPr>
                 <w:b/>
               </w:rPr>
-              <w:t>Implementar soluciones sistémicas integrales para automatizar u optimizar procesos de negocio de acuerdo a las necesidades de la organización.</w:t>
+              <w:t xml:space="preserve">Implementar soluciones sistémicas integrales para automatizar u optimizar procesos de </w:t>
+            </w:r>
+            <w:r>
+              <w:rPr>
+                <w:b/>
+              </w:rPr>
+              <w:lastRenderedPageBreak/>
+              <w:t>negocio de acuerdo a las necesidades de la organización.</w:t>
             </w:r>
           </w:p>
         </w:tc>
@@ -7435,6 +7057,7 @@
               <w:rPr>
                 <w:b/>
               </w:rPr>
+              <w:lastRenderedPageBreak/>
               <w:t xml:space="preserve">Integración del pipeline con el </w:t>
             </w:r>
             <w:proofErr w:type="spellStart"/>
@@ -7480,7 +7103,14 @@
               <w:rPr>
                 <w:b/>
               </w:rPr>
-              <w:t xml:space="preserve"> web, validando el resultado contra la base de datos y disparando alertas cuando corresponda.</w:t>
+              <w:t xml:space="preserve"> web, </w:t>
+            </w:r>
+            <w:r>
+              <w:rPr>
+                <w:b/>
+              </w:rPr>
+              <w:lastRenderedPageBreak/>
+              <w:t>validando el resultado contra la base de datos y disparando alertas cuando corresponda.</w:t>
             </w:r>
           </w:p>
         </w:tc>
@@ -7497,6 +7127,7 @@
               <w:rPr>
                 <w:b/>
               </w:rPr>
+              <w:lastRenderedPageBreak/>
               <w:t>Entorno de integración conjunta (</w:t>
             </w:r>
             <w:proofErr w:type="spellStart"/>
@@ -7511,7 +7142,14 @@
               <w:rPr>
                 <w:b/>
               </w:rPr>
-              <w:t xml:space="preserve"> + modelo ML), base de datos del sistema.</w:t>
+              <w:t xml:space="preserve"> + modelo ML), </w:t>
+            </w:r>
+            <w:r>
+              <w:rPr>
+                <w:b/>
+              </w:rPr>
+              <w:lastRenderedPageBreak/>
+              <w:t>base de datos del sistema.</w:t>
             </w:r>
           </w:p>
         </w:tc>
@@ -7528,6 +7166,7 @@
               <w:rPr>
                 <w:b/>
               </w:rPr>
+              <w:lastRenderedPageBreak/>
               <w:t>2 semanas (S13-S14)</w:t>
             </w:r>
           </w:p>
@@ -7562,7 +7201,14 @@
               <w:rPr>
                 <w:b/>
               </w:rPr>
-              <w:t xml:space="preserve">Etapa de mayor riesgo técnico, al depender de la integración simultánea de los módulos de ML y del </w:t>
+              <w:t xml:space="preserve">Etapa de mayor riesgo técnico, al depender de la integración simultánea de los módulos de </w:t>
+            </w:r>
+            <w:r>
+              <w:rPr>
+                <w:b/>
+              </w:rPr>
+              <w:lastRenderedPageBreak/>
+              <w:t xml:space="preserve">ML y del </w:t>
             </w:r>
             <w:proofErr w:type="spellStart"/>
             <w:r>
@@ -7598,6 +7244,7 @@
               <w:rPr>
                 <w:b/>
               </w:rPr>
+              <w:lastRenderedPageBreak/>
               <w:t>Realizar pruebas de certificación tanto de los productos como de los procesos utilizando buenas prácticas definidas por la industria.</w:t>
             </w:r>
           </w:p>
@@ -7734,7 +7381,6 @@
               <w:rPr>
                 <w:b/>
               </w:rPr>
-              <w:lastRenderedPageBreak/>
               <w:t>Gestionar proyectos informáticos, ofreciendo alternativas para la toma de decisiones de acuerdo a los requerimientos de la organización.</w:t>
             </w:r>
           </w:p>
@@ -8970,6 +8616,7 @@
               <w:rPr>
                 <w:b/>
               </w:rPr>
+              <w:lastRenderedPageBreak/>
               <w:t>Análisis y definición del proyecto APT</w:t>
             </w:r>
           </w:p>
@@ -10308,7 +9955,6 @@
               <w:rPr>
                 <w:b/>
               </w:rPr>
-              <w:lastRenderedPageBreak/>
               <w:t>Modelo de datos y estructura base web (Brandon)</w:t>
             </w:r>
           </w:p>
@@ -11637,7 +11283,31 @@
               <w:rPr>
                 <w:b/>
               </w:rPr>
-              <w:t>Integración de cámara IP RTSP/ONVIF (Erick)</w:t>
+              <w:t>Integración de cámara IP</w:t>
+            </w:r>
+            <w:r>
+              <w:rPr>
+                <w:b/>
+              </w:rPr>
+              <w:t xml:space="preserve"> + </w:t>
+            </w:r>
+            <w:r>
+              <w:rPr>
+                <w:b/>
+              </w:rPr>
+              <w:t xml:space="preserve">Raspberry </w:t>
+            </w:r>
+            <w:r>
+              <w:rPr>
+                <w:b/>
+              </w:rPr>
+              <w:t xml:space="preserve">PI </w:t>
+            </w:r>
+            <w:r>
+              <w:rPr>
+                <w:b/>
+              </w:rPr>
+              <w:t>(Erick)</w:t>
             </w:r>
           </w:p>
         </w:tc>
@@ -11891,6 +11561,7 @@
               <w:rPr>
                 <w:b/>
               </w:rPr>
+              <w:lastRenderedPageBreak/>
               <w:t>Sistema de alertas en tiempo real (Brandon)</w:t>
             </w:r>
           </w:p>
@@ -14680,21 +14351,6 @@
 </file>
 
 <file path=customXml/item1.xml><?xml version="1.0" encoding="utf-8"?>
-<?mso-contentType ?>
-<FormTemplates xmlns="http://schemas.microsoft.com/sharepoint/v3/contenttype/forms">
-  <Display>DocumentLibraryForm</Display>
-  <Edit>DocumentLibraryForm</Edit>
-  <New>DocumentLibraryForm</New>
-</FormTemplates>
-</file>
-
-<file path=customXml/item2.xml><?xml version="1.0" encoding="utf-8"?>
-<p:properties xmlns:p="http://schemas.microsoft.com/office/2006/metadata/properties" xmlns:xsi="http://www.w3.org/2001/XMLSchema-instance" xmlns:pc="http://schemas.microsoft.com/office/infopath/2007/PartnerControls">
-  <documentManagement/>
-</p:properties>
-</file>
-
-<file path=customXml/item3.xml><?xml version="1.0" encoding="utf-8"?>
 <ct:contentTypeSchema xmlns:ct="http://schemas.microsoft.com/office/2006/metadata/contentType" xmlns:ma="http://schemas.microsoft.com/office/2006/metadata/properties/metaAttributes" ct:_="" ma:_="" ma:contentTypeName="Documento" ma:contentTypeID="0x010100E96778489EE7714D8BD12CC105EB918B" ma:contentTypeVersion="2" ma:contentTypeDescription="Crear nuevo documento." ma:contentTypeScope="" ma:versionID="416c5c7ae9b5d54d83875cd3c65194e3">
   <xsd:schema xmlns:xsd="http://www.w3.org/2001/XMLSchema" xmlns:xs="http://www.w3.org/2001/XMLSchema" xmlns:p="http://schemas.microsoft.com/office/2006/metadata/properties" xmlns:ns2="126e8a1c-9ea9-435a-ac89-d06c80d62e30" targetNamespace="http://schemas.microsoft.com/office/2006/metadata/properties" ma:root="true" ma:fieldsID="70a237c842677bd850644f8595079f5e" ns2:_="">
     <xsd:import namespace="126e8a1c-9ea9-435a-ac89-d06c80d62e30"/>
@@ -14826,24 +14482,22 @@
 </ct:contentTypeSchema>
 </file>
 
-<file path=customXml/itemProps1.xml><?xml version="1.0" encoding="utf-8"?>
-<ds:datastoreItem xmlns:ds="http://schemas.openxmlformats.org/officeDocument/2006/customXml" ds:itemID="{F3E3E2F7-59E7-4722-B872-D023DC9D1CC1}">
-  <ds:schemaRefs>
-    <ds:schemaRef ds:uri="http://schemas.microsoft.com/sharepoint/v3/contenttype/forms"/>
-  </ds:schemaRefs>
-</ds:datastoreItem>
+<file path=customXml/item2.xml><?xml version="1.0" encoding="utf-8"?>
+<p:properties xmlns:p="http://schemas.microsoft.com/office/2006/metadata/properties" xmlns:xsi="http://www.w3.org/2001/XMLSchema-instance" xmlns:pc="http://schemas.microsoft.com/office/infopath/2007/PartnerControls">
+  <documentManagement/>
+</p:properties>
 </file>
 
-<file path=customXml/itemProps2.xml><?xml version="1.0" encoding="utf-8"?>
-<ds:datastoreItem xmlns:ds="http://schemas.openxmlformats.org/officeDocument/2006/customXml" ds:itemID="{38174882-579A-45DC-A704-C035A9357F73}">
-  <ds:schemaRefs>
-    <ds:schemaRef ds:uri="http://schemas.microsoft.com/office/2006/metadata/properties"/>
-    <ds:schemaRef ds:uri="http://schemas.microsoft.com/office/infopath/2007/PartnerControls"/>
-  </ds:schemaRefs>
-</ds:datastoreItem>
+<file path=customXml/item3.xml><?xml version="1.0" encoding="utf-8"?>
+<?mso-contentType ?>
+<FormTemplates xmlns="http://schemas.microsoft.com/sharepoint/v3/contenttype/forms">
+  <Display>DocumentLibraryForm</Display>
+  <Edit>DocumentLibraryForm</Edit>
+  <New>DocumentLibraryForm</New>
+</FormTemplates>
 </file>
 
-<file path=customXml/itemProps3.xml><?xml version="1.0" encoding="utf-8"?>
+<file path=customXml/itemProps1.xml><?xml version="1.0" encoding="utf-8"?>
 <ds:datastoreItem xmlns:ds="http://schemas.openxmlformats.org/officeDocument/2006/customXml" ds:itemID="{7C9B9CFF-B258-43B4-948A-968A031773F5}">
   <ds:schemaRefs>
     <ds:schemaRef ds:uri="http://schemas.microsoft.com/office/2006/metadata/contentType"/>
@@ -14859,4 +14513,21 @@
     <ds:schemaRef ds:uri="http://schemas.microsoft.com/internal/obd"/>
   </ds:schemaRefs>
 </ds:datastoreItem>
+</file>
+
+<file path=customXml/itemProps2.xml><?xml version="1.0" encoding="utf-8"?>
+<ds:datastoreItem xmlns:ds="http://schemas.openxmlformats.org/officeDocument/2006/customXml" ds:itemID="{38174882-579A-45DC-A704-C035A9357F73}">
+  <ds:schemaRefs>
+    <ds:schemaRef ds:uri="http://schemas.microsoft.com/office/2006/metadata/properties"/>
+    <ds:schemaRef ds:uri="http://schemas.microsoft.com/office/infopath/2007/PartnerControls"/>
+  </ds:schemaRefs>
+</ds:datastoreItem>
+</file>
+
+<file path=customXml/itemProps3.xml><?xml version="1.0" encoding="utf-8"?>
+<ds:datastoreItem xmlns:ds="http://schemas.openxmlformats.org/officeDocument/2006/customXml" ds:itemID="{F3E3E2F7-59E7-4722-B872-D023DC9D1CC1}">
+  <ds:schemaRefs>
+    <ds:schemaRef ds:uri="http://schemas.microsoft.com/sharepoint/v3/contenttype/forms"/>
+  </ds:schemaRefs>
+</ds:datastoreItem>
 </file>
</xml_diff>